<commit_message>
Fixed images in docs
</commit_message>
<xml_diff>
--- a/docs/Силинцев Владислав Лаб 3 P3314.docx
+++ b/docs/Силинцев Владислав Лаб 3 P3314.docx
@@ -863,15 +863,7 @@
       </m:oMath>
       <w:r>
         <w:rPr/>
-        <w:t>). Число точек используемых в выборке 100000, число точек, сформированных внутри треугольника также 100000.</w:t>
-        <w:br/>
-      </w:r>
-      <w:r>
-        <w:rPr/>
-      </w:r>
-      <w:r>
-        <w:rPr/>
-        <w:br/>
+        <w:t xml:space="preserve">). Число точек используемых в выборке 100000, число точек, сформированных внутри треугольника также 100000. </w:t>
       </w:r>
       <w:r>
         <w:rPr>
@@ -881,33 +873,72 @@
         </w:rPr>
         <w:t>Доказать, что полученное распределение равномерное и все точки лежат внутри треугольника.</w:t>
       </w:r>
-      <w:r>
+    </w:p>
+    <w:p>
+      <w:pPr>
+        <w:pStyle w:val="BodyText"/>
+        <w:numPr>
+          <w:ilvl w:val="0"/>
+          <w:numId w:val="0"/>
+        </w:numPr>
+        <w:ind w:hanging="0" w:left="720"/>
+        <w:rPr>
+          <w:rFonts w:cs="Times New Roman"/>
+          <w:sz w:val="28"/>
+          <w:lang w:val="ru-RU"/>
+        </w:rPr>
+      </w:pPr>
+      <w:r>
+        <w:rPr>
+          <w:rFonts w:cs="Times New Roman"/>
+          <w:sz w:val="28"/>
+          <w:lang w:val="ru-RU"/>
+        </w:rPr>
         <mc:AlternateContent>
           <mc:Choice Requires="wps">
             <w:drawing>
-              <wp:inline distT="0" distB="0" distL="0" distR="0">
-                <wp:extent cx="3888740" cy="2840990"/>
+              <wp:anchor distT="0" distB="0" distL="0" distR="0" simplePos="0" relativeHeight="8" behindDoc="0" locked="0" layoutInCell="0" allowOverlap="1">
+                <wp:simplePos x="0" y="0"/>
+                <wp:positionH relativeFrom="column">
+                  <wp:align>center</wp:align>
+                </wp:positionH>
+                <wp:positionV relativeFrom="paragraph">
+                  <wp:posOffset>635</wp:posOffset>
+                </wp:positionV>
+                <wp:extent cx="3888740" cy="3061335"/>
                 <wp:effectExtent l="0" t="0" r="0" b="0"/>
+                <wp:wrapSquare wrapText="largest"/>
                 <wp:docPr id="4" name="Врезка4"/>
                 <a:graphic xmlns:a="http://schemas.openxmlformats.org/drawingml/2006/main">
                   <a:graphicData uri="http://schemas.microsoft.com/office/word/2010/wordprocessingShape">
                     <wps:wsp>
-                      <wps:cNvSpPr txBox="1"/>
+                      <wps:cNvSpPr/>
                       <wps:spPr>
                         <a:xfrm>
                           <a:off x="0" y="0"/>
-                          <a:ext cx="3888740" cy="2840990"/>
+                          <a:ext cx="3888720" cy="3061440"/>
                         </a:xfrm>
-                        <a:prstGeom prst="rect"/>
+                        <a:prstGeom prst="rect">
+                          <a:avLst/>
+                        </a:prstGeom>
                         <a:solidFill>
-                          <a:srgbClr val="FFFFFF"/>
+                          <a:srgbClr val="ffffff"/>
                         </a:solidFill>
+                        <a:ln w="0">
+                          <a:noFill/>
+                        </a:ln>
                       </wps:spPr>
+                      <wps:style>
+                        <a:lnRef idx="0"/>
+                        <a:fillRef idx="0"/>
+                        <a:effectRef idx="0"/>
+                        <a:fontRef idx="minor"/>
+                      </wps:style>
                       <wps:txbx>
                         <w:txbxContent>
                           <w:p>
                             <w:pPr>
-                              <w:pStyle w:val="Style21"/>
+                              <w:pStyle w:val="user7"/>
                               <w:spacing w:before="120" w:after="120"/>
                               <w:rPr/>
                             </w:pPr>
@@ -951,6 +982,9 @@
                                   </a:graphic>
                                 </wp:inline>
                               </w:drawing>
+                            </w:r>
+                            <w:r>
+                              <w:rPr/>
                               <w:t xml:space="preserve">Рисунок </w:t>
                             </w:r>
                             <w:r>
@@ -975,28 +1009,30 @@
                             </w:r>
                             <w:r>
                               <w:rPr/>
-                              <w:t>: Треугольник</w:t>
+                              <w:t>: Равномерное распределение в треугольнике</w:t>
                             </w:r>
                           </w:p>
                         </w:txbxContent>
                       </wps:txbx>
-                      <wps:bodyPr anchor="t" lIns="0" tIns="0" rIns="0" bIns="0">
+                      <wps:bodyPr lIns="0" rIns="0" tIns="0" bIns="0" anchor="t">
                         <a:noAutofit/>
                       </wps:bodyPr>
                     </wps:wsp>
                   </a:graphicData>
                 </a:graphic>
-              </wp:inline>
+              </wp:anchor>
             </w:drawing>
           </mc:Choice>
           <mc:Fallback>
             <w:pict>
-              <v:rect style="position:absolute;rotation:-0;width:306.2pt;height:223.7pt;mso-wrap-distance-left:0pt;mso-wrap-distance-right:0pt;mso-wrap-distance-top:0pt;mso-wrap-distance-bottom:0pt;margin-top:-223.7pt;mso-position-vertical:top;mso-position-vertical-relative:text;margin-left:80.75pt;mso-position-horizontal:center;mso-position-horizontal-relative:text">
-                <v:textbox inset="0in,0in,0in,0in">
+              <v:rect id="shape_0" fillcolor="white" stroked="f" o:allowincell="f" style="position:absolute;margin-left:80.75pt;margin-top:0.05pt;width:306.15pt;height:241pt;mso-wrap-style:square;v-text-anchor:top;mso-position-horizontal:center">
+                <v:fill o:detectmouseclick="t" type="solid" color2="black"/>
+                <v:stroke color="#3465a4" joinstyle="round" endcap="flat"/>
+                <v:textbox>
                   <w:txbxContent>
                     <w:p>
                       <w:pPr>
-                        <w:pStyle w:val="Style21"/>
+                        <w:pStyle w:val="user7"/>
                         <w:spacing w:before="120" w:after="120"/>
                         <w:rPr/>
                       </w:pPr>
@@ -1040,6 +1076,9 @@
                             </a:graphic>
                           </wp:inline>
                         </w:drawing>
+                      </w:r>
+                      <w:r>
+                        <w:rPr/>
                         <w:t xml:space="preserve">Рисунок </w:t>
                       </w:r>
                       <w:r>
@@ -1064,7 +1103,7 @@
                       </w:r>
                       <w:r>
                         <w:rPr/>
-                        <w:t>: Треугольник</w:t>
+                        <w:t>: Равномерное распределение в треугольнике</w:t>
                       </w:r>
                     </w:p>
                   </w:txbxContent>
@@ -1079,10 +1118,32 @@
     <w:p>
       <w:pPr>
         <w:pStyle w:val="BodyText"/>
+        <w:widowControl/>
+        <w:numPr>
+          <w:ilvl w:val="0"/>
+          <w:numId w:val="0"/>
+        </w:numPr>
+        <w:suppressAutoHyphens w:val="true"/>
+        <w:spacing w:lineRule="auto" w:line="360"/>
+        <w:ind w:firstLine="709" w:left="0"/>
+        <w:jc w:val="both"/>
+        <w:rPr/>
+      </w:pPr>
+      <w:r>
+        <w:rPr/>
+      </w:r>
+      <w:r>
+        <w:br w:type="page"/>
+      </w:r>
+    </w:p>
+    <w:p>
+      <w:pPr>
+        <w:pStyle w:val="BodyText"/>
         <w:numPr>
           <w:ilvl w:val="0"/>
           <w:numId w:val="2"/>
         </w:numPr>
+        <w:spacing w:before="0" w:after="140"/>
         <w:rPr/>
       </w:pPr>
       <w:r>
@@ -1213,15 +1274,7 @@
       </m:oMath>
       <w:r>
         <w:rPr/>
-        <w:t>. Число точек используемых в выборке 100000, число точек, сформированных внутри круга также 100000.</w:t>
-        <w:br/>
-      </w:r>
-      <w:r>
-        <w:rPr/>
-      </w:r>
-      <w:r>
-        <w:rPr/>
-        <w:br/>
+        <w:t xml:space="preserve">. Число точек используемых в выборке 100000, число точек, сформированных внутри круга также 100000. </w:t>
       </w:r>
       <w:r>
         <w:rPr>
@@ -1231,33 +1284,72 @@
         </w:rPr>
         <w:t>Доказать, что полученное распределение равномерное и все точки лежат внутри круга.</w:t>
       </w:r>
-      <w:r>
+    </w:p>
+    <w:p>
+      <w:pPr>
+        <w:pStyle w:val="BodyText"/>
+        <w:numPr>
+          <w:ilvl w:val="0"/>
+          <w:numId w:val="0"/>
+        </w:numPr>
+        <w:ind w:hanging="0" w:left="720"/>
+        <w:rPr>
+          <w:rFonts w:cs="Times New Roman"/>
+          <w:sz w:val="28"/>
+          <w:lang w:val="ru-RU"/>
+        </w:rPr>
+      </w:pPr>
+      <w:r>
+        <w:rPr>
+          <w:rFonts w:cs="Times New Roman"/>
+          <w:sz w:val="28"/>
+          <w:lang w:val="ru-RU"/>
+        </w:rPr>
         <mc:AlternateContent>
           <mc:Choice Requires="wps">
             <w:drawing>
-              <wp:inline distT="0" distB="0" distL="0" distR="0">
-                <wp:extent cx="3827780" cy="2694940"/>
+              <wp:anchor distT="0" distB="0" distL="0" distR="0" simplePos="0" relativeHeight="10" behindDoc="0" locked="0" layoutInCell="0" allowOverlap="1">
+                <wp:simplePos x="0" y="0"/>
+                <wp:positionH relativeFrom="column">
+                  <wp:align>center</wp:align>
+                </wp:positionH>
+                <wp:positionV relativeFrom="paragraph">
+                  <wp:posOffset>635</wp:posOffset>
+                </wp:positionV>
+                <wp:extent cx="3827780" cy="2915285"/>
                 <wp:effectExtent l="0" t="0" r="0" b="0"/>
+                <wp:wrapSquare wrapText="largest"/>
                 <wp:docPr id="7" name="Врезка5"/>
                 <a:graphic xmlns:a="http://schemas.openxmlformats.org/drawingml/2006/main">
                   <a:graphicData uri="http://schemas.microsoft.com/office/word/2010/wordprocessingShape">
                     <wps:wsp>
-                      <wps:cNvSpPr txBox="1"/>
+                      <wps:cNvSpPr/>
                       <wps:spPr>
                         <a:xfrm>
                           <a:off x="0" y="0"/>
-                          <a:ext cx="3827780" cy="2694940"/>
+                          <a:ext cx="3827880" cy="2915280"/>
                         </a:xfrm>
-                        <a:prstGeom prst="rect"/>
+                        <a:prstGeom prst="rect">
+                          <a:avLst/>
+                        </a:prstGeom>
                         <a:solidFill>
-                          <a:srgbClr val="FFFFFF"/>
+                          <a:srgbClr val="ffffff"/>
                         </a:solidFill>
+                        <a:ln w="0">
+                          <a:noFill/>
+                        </a:ln>
                       </wps:spPr>
+                      <wps:style>
+                        <a:lnRef idx="0"/>
+                        <a:fillRef idx="0"/>
+                        <a:effectRef idx="0"/>
+                        <a:fontRef idx="minor"/>
+                      </wps:style>
                       <wps:txbx>
                         <w:txbxContent>
                           <w:p>
                             <w:pPr>
-                              <w:pStyle w:val="Style21"/>
+                              <w:pStyle w:val="user7"/>
                               <w:spacing w:before="120" w:after="120"/>
                               <w:rPr/>
                             </w:pPr>
@@ -1301,6 +1393,9 @@
                                   </a:graphic>
                                 </wp:inline>
                               </w:drawing>
+                            </w:r>
+                            <w:r>
+                              <w:rPr/>
                               <w:t xml:space="preserve">Рисунок </w:t>
                             </w:r>
                             <w:r>
@@ -1325,28 +1420,30 @@
                             </w:r>
                             <w:r>
                               <w:rPr/>
-                              <w:t>: Круг</w:t>
+                              <w:t>: Равномерное распределение внутри круга</w:t>
                             </w:r>
                           </w:p>
                         </w:txbxContent>
                       </wps:txbx>
-                      <wps:bodyPr anchor="t" lIns="0" tIns="0" rIns="0" bIns="0">
+                      <wps:bodyPr lIns="0" rIns="0" tIns="0" bIns="0" anchor="t">
                         <a:noAutofit/>
                       </wps:bodyPr>
                     </wps:wsp>
                   </a:graphicData>
                 </a:graphic>
-              </wp:inline>
+              </wp:anchor>
             </w:drawing>
           </mc:Choice>
           <mc:Fallback>
             <w:pict>
-              <v:rect style="position:absolute;rotation:-0;width:301.4pt;height:212.2pt;mso-wrap-distance-left:0pt;mso-wrap-distance-right:0pt;mso-wrap-distance-top:0pt;mso-wrap-distance-bottom:0pt;margin-top:-212.2pt;mso-position-vertical:top;mso-position-vertical-relative:text;margin-left:0pt;mso-position-horizontal:center;mso-position-horizontal-relative:text">
-                <v:textbox inset="0in,0in,0in,0in">
+              <v:rect id="shape_0" fillcolor="white" stroked="f" o:allowincell="f" style="position:absolute;margin-left:83.15pt;margin-top:0.05pt;width:301.35pt;height:229.5pt;mso-wrap-style:square;v-text-anchor:top;mso-position-horizontal:center">
+                <v:fill o:detectmouseclick="t" type="solid" color2="black"/>
+                <v:stroke color="#3465a4" joinstyle="round" endcap="flat"/>
+                <v:textbox>
                   <w:txbxContent>
                     <w:p>
                       <w:pPr>
-                        <w:pStyle w:val="Style21"/>
+                        <w:pStyle w:val="user7"/>
                         <w:spacing w:before="120" w:after="120"/>
                         <w:rPr/>
                       </w:pPr>
@@ -1390,6 +1487,9 @@
                             </a:graphic>
                           </wp:inline>
                         </w:drawing>
+                      </w:r>
+                      <w:r>
+                        <w:rPr/>
                         <w:t xml:space="preserve">Рисунок </w:t>
                       </w:r>
                       <w:r>
@@ -1414,7 +1514,7 @@
                       </w:r>
                       <w:r>
                         <w:rPr/>
-                        <w:t>: Круг</w:t>
+                        <w:t>: Равномерное распределение внутри круга</w:t>
                       </w:r>
                     </w:p>
                   </w:txbxContent>
@@ -1429,10 +1529,40 @@
     <w:p>
       <w:pPr>
         <w:pStyle w:val="BodyText"/>
+        <w:widowControl/>
+        <w:numPr>
+          <w:ilvl w:val="0"/>
+          <w:numId w:val="0"/>
+        </w:numPr>
+        <w:suppressAutoHyphens w:val="true"/>
+        <w:spacing w:lineRule="auto" w:line="360"/>
+        <w:ind w:firstLine="709" w:left="0"/>
+        <w:jc w:val="both"/>
+        <w:rPr>
+          <w:rFonts w:ascii="Times New Roman" w:hAnsi="Times New Roman" w:cs="Times New Roman"/>
+          <w:sz w:val="28"/>
+          <w:lang w:val="ru-RU"/>
+        </w:rPr>
+      </w:pPr>
+      <w:r>
+        <w:rPr>
+          <w:rFonts w:cs="Times New Roman"/>
+          <w:sz w:val="28"/>
+          <w:lang w:val="ru-RU"/>
+        </w:rPr>
+      </w:r>
+      <w:r>
+        <w:br w:type="page"/>
+      </w:r>
+    </w:p>
+    <w:p>
+      <w:pPr>
+        <w:pStyle w:val="BodyText"/>
         <w:numPr>
           <w:ilvl w:val="0"/>
           <w:numId w:val="2"/>
         </w:numPr>
+        <w:spacing w:before="0" w:after="140"/>
         <w:rPr>
           <w:rFonts w:ascii="Times New Roman" w:hAnsi="Times New Roman" w:cs="Times New Roman"/>
           <w:sz w:val="28"/>
@@ -1448,11 +1578,7 @@
         <w:t xml:space="preserve">Сформировать равномерное распределение случайных направлений в пространстве (точек на единичной сфере </w:t>
       </w:r>
       <w:r>
-        <w:rPr>
-          <w:rFonts w:cs="Times New Roman"/>
-          <w:sz w:val="28"/>
-          <w:lang w:val="ru-RU"/>
-        </w:rPr>
+        <w:rPr/>
       </w:r>
       <m:oMath xmlns:m="http://schemas.openxmlformats.org/officeDocument/2006/math">
         <m:sSub>
@@ -1522,52 +1648,74 @@
           <w:sz w:val="28"/>
           <w:lang w:val="ru-RU"/>
         </w:rPr>
-        <w:t>). Число точек используемых в выборке 100000, число полученных направлений также 100000.</w:t>
-        <w:br/>
-      </w:r>
+        <w:t>). Число точек используемых в выборке 100000, число полученных направлений также 100000. Доказать, что полученное распределение равномерное и для всех выборок были сформированы направления.</w:t>
+      </w:r>
+    </w:p>
+    <w:p>
+      <w:pPr>
+        <w:pStyle w:val="BodyText"/>
+        <w:numPr>
+          <w:ilvl w:val="0"/>
+          <w:numId w:val="0"/>
+        </w:numPr>
+        <w:ind w:hanging="0" w:left="720"/>
+        <w:rPr>
+          <w:rFonts w:ascii="Times New Roman" w:hAnsi="Times New Roman" w:cs="Times New Roman"/>
+          <w:sz w:val="28"/>
+          <w:lang w:val="ru-RU"/>
+        </w:rPr>
+      </w:pPr>
       <w:r>
         <w:rPr>
           <w:rFonts w:cs="Times New Roman"/>
           <w:sz w:val="28"/>
           <w:lang w:val="ru-RU"/>
         </w:rPr>
-      </w:r>
-      <w:r>
-        <w:rPr>
-          <w:rFonts w:cs="Times New Roman"/>
-          <w:sz w:val="28"/>
-          <w:lang w:val="ru-RU"/>
-        </w:rPr>
-        <w:br/>
-        <w:t>Доказать, что полученное распределение равномерное и для всех выборок были сформированы направления.</w:t>
-      </w:r>
-      <w:r>
         <mc:AlternateContent>
           <mc:Choice Requires="wps">
             <w:drawing>
-              <wp:inline distT="0" distB="0" distL="0" distR="0">
+              <wp:anchor distT="0" distB="0" distL="0" distR="0" simplePos="0" relativeHeight="13" behindDoc="0" locked="0" layoutInCell="0" allowOverlap="1">
+                <wp:simplePos x="0" y="0"/>
+                <wp:positionH relativeFrom="column">
+                  <wp:align>center</wp:align>
+                </wp:positionH>
+                <wp:positionV relativeFrom="paragraph">
+                  <wp:posOffset>635</wp:posOffset>
+                </wp:positionV>
                 <wp:extent cx="4200525" cy="3256280"/>
                 <wp:effectExtent l="0" t="0" r="0" b="0"/>
+                <wp:wrapSquare wrapText="largest"/>
                 <wp:docPr id="10" name="Врезка6"/>
                 <a:graphic xmlns:a="http://schemas.openxmlformats.org/drawingml/2006/main">
                   <a:graphicData uri="http://schemas.microsoft.com/office/word/2010/wordprocessingShape">
                     <wps:wsp>
-                      <wps:cNvSpPr txBox="1"/>
+                      <wps:cNvSpPr/>
                       <wps:spPr>
                         <a:xfrm>
                           <a:off x="0" y="0"/>
-                          <a:ext cx="4200525" cy="3256280"/>
+                          <a:ext cx="4200480" cy="3256200"/>
                         </a:xfrm>
-                        <a:prstGeom prst="rect"/>
+                        <a:prstGeom prst="rect">
+                          <a:avLst/>
+                        </a:prstGeom>
                         <a:solidFill>
-                          <a:srgbClr val="FFFFFF"/>
+                          <a:srgbClr val="ffffff"/>
                         </a:solidFill>
+                        <a:ln w="0">
+                          <a:noFill/>
+                        </a:ln>
                       </wps:spPr>
+                      <wps:style>
+                        <a:lnRef idx="0"/>
+                        <a:fillRef idx="0"/>
+                        <a:effectRef idx="0"/>
+                        <a:fontRef idx="minor"/>
+                      </wps:style>
                       <wps:txbx>
                         <w:txbxContent>
                           <w:p>
                             <w:pPr>
-                              <w:pStyle w:val="Style21"/>
+                              <w:pStyle w:val="user7"/>
                               <w:spacing w:before="120" w:after="120"/>
                               <w:rPr/>
                             </w:pPr>
@@ -1611,6 +1759,9 @@
                                   </a:graphic>
                                 </wp:inline>
                               </w:drawing>
+                            </w:r>
+                            <w:r>
+                              <w:rPr/>
                               <w:t xml:space="preserve">Рисунок </w:t>
                             </w:r>
                             <w:r>
@@ -1640,23 +1791,25 @@
                           </w:p>
                         </w:txbxContent>
                       </wps:txbx>
-                      <wps:bodyPr anchor="t" lIns="0" tIns="0" rIns="0" bIns="0">
+                      <wps:bodyPr lIns="0" rIns="0" tIns="0" bIns="0" anchor="t">
                         <a:noAutofit/>
                       </wps:bodyPr>
                     </wps:wsp>
                   </a:graphicData>
                 </a:graphic>
-              </wp:inline>
+              </wp:anchor>
             </w:drawing>
           </mc:Choice>
           <mc:Fallback>
             <w:pict>
-              <v:rect style="position:absolute;rotation:-0;width:330.75pt;height:256.4pt;mso-wrap-distance-left:0pt;mso-wrap-distance-right:0pt;mso-wrap-distance-top:0pt;mso-wrap-distance-bottom:0pt;margin-top:-256.4pt;mso-position-vertical:top;mso-position-vertical-relative:text;margin-left:0pt;mso-position-horizontal:center;mso-position-horizontal-relative:text">
-                <v:textbox inset="0in,0in,0in,0in">
+              <v:rect id="shape_0" fillcolor="white" stroked="f" o:allowincell="f" style="position:absolute;margin-left:68.45pt;margin-top:0.05pt;width:330.7pt;height:256.35pt;mso-wrap-style:square;v-text-anchor:top;mso-position-horizontal:center">
+                <v:fill o:detectmouseclick="t" type="solid" color2="black"/>
+                <v:stroke color="#3465a4" joinstyle="round" endcap="flat"/>
+                <v:textbox>
                   <w:txbxContent>
                     <w:p>
                       <w:pPr>
-                        <w:pStyle w:val="Style21"/>
+                        <w:pStyle w:val="user7"/>
                         <w:spacing w:before="120" w:after="120"/>
                         <w:rPr/>
                       </w:pPr>
@@ -1700,6 +1853,9 @@
                             </a:graphic>
                           </wp:inline>
                         </w:drawing>
+                      </w:r>
+                      <w:r>
+                        <w:rPr/>
                         <w:t xml:space="preserve">Рисунок </w:t>
                       </w:r>
                       <w:r>
@@ -1739,10 +1895,40 @@
     <w:p>
       <w:pPr>
         <w:pStyle w:val="BodyText"/>
+        <w:widowControl/>
+        <w:numPr>
+          <w:ilvl w:val="0"/>
+          <w:numId w:val="0"/>
+        </w:numPr>
+        <w:suppressAutoHyphens w:val="true"/>
+        <w:spacing w:lineRule="auto" w:line="360"/>
+        <w:ind w:firstLine="709" w:left="0"/>
+        <w:jc w:val="both"/>
+        <w:rPr>
+          <w:rFonts w:ascii="Times New Roman" w:hAnsi="Times New Roman" w:cs="Times New Roman"/>
+          <w:sz w:val="28"/>
+          <w:lang w:val="ru-RU"/>
+        </w:rPr>
+      </w:pPr>
+      <w:r>
+        <w:rPr>
+          <w:rFonts w:cs="Times New Roman"/>
+          <w:sz w:val="28"/>
+          <w:lang w:val="ru-RU"/>
+        </w:rPr>
+      </w:r>
+      <w:r>
+        <w:br w:type="page"/>
+      </w:r>
+    </w:p>
+    <w:p>
+      <w:pPr>
+        <w:pStyle w:val="BodyText"/>
         <w:numPr>
           <w:ilvl w:val="0"/>
           <w:numId w:val="2"/>
         </w:numPr>
+        <w:spacing w:before="0" w:after="140"/>
         <w:rPr>
           <w:rFonts w:ascii="Times New Roman" w:hAnsi="Times New Roman" w:cs="Times New Roman"/>
           <w:sz w:val="28"/>
@@ -1758,11 +1944,7 @@
         <w:t xml:space="preserve">Сформировать распределение случайных направлений с косинусным распределением плотности вероятности относительно вектора </w:t>
       </w:r>
       <w:r>
-        <w:rPr>
-          <w:rFonts w:cs="Times New Roman"/>
-          <w:sz w:val="28"/>
-          <w:lang w:val="ru-RU"/>
-        </w:rPr>
+        <w:rPr/>
       </w:r>
       <m:oMath xmlns:m="http://schemas.openxmlformats.org/officeDocument/2006/math">
         <m:r>
@@ -1781,11 +1963,7 @@
         <w:t xml:space="preserve"> (единичных векторов, ориентированных по направлению </w:t>
       </w:r>
       <w:r>
-        <w:rPr>
-          <w:rFonts w:cs="Times New Roman"/>
-          <w:sz w:val="28"/>
-          <w:lang w:val="ru-RU"/>
-        </w:rPr>
+        <w:rPr/>
       </w:r>
       <m:oMath xmlns:m="http://schemas.openxmlformats.org/officeDocument/2006/math">
         <m:sSub>
@@ -1816,11 +1994,7 @@
         <w:t xml:space="preserve"> – </w:t>
       </w:r>
       <w:r>
-        <w:rPr>
-          <w:rFonts w:cs="Times New Roman"/>
-          <w:sz w:val="28"/>
-          <w:lang w:val="ru-RU"/>
-        </w:rPr>
+        <w:rPr/>
       </w:r>
       <m:oMath xmlns:m="http://schemas.openxmlformats.org/officeDocument/2006/math">
         <m:r>
@@ -1839,11 +2013,7 @@
         <w:t xml:space="preserve">, </w:t>
       </w:r>
       <w:r>
-        <w:rPr>
-          <w:rFonts w:cs="Times New Roman"/>
-          <w:sz w:val="28"/>
-          <w:lang w:val="ru-RU"/>
-        </w:rPr>
+        <w:rPr/>
       </w:r>
       <m:oMath xmlns:m="http://schemas.openxmlformats.org/officeDocument/2006/math">
         <m:sSub>
@@ -1874,11 +2044,7 @@
         <w:t xml:space="preserve"> – </w:t>
       </w:r>
       <w:r>
-        <w:rPr>
-          <w:rFonts w:cs="Times New Roman"/>
-          <w:sz w:val="28"/>
-          <w:lang w:val="ru-RU"/>
-        </w:rPr>
+        <w:rPr/>
       </w:r>
       <m:oMath xmlns:m="http://schemas.openxmlformats.org/officeDocument/2006/math">
         <m:r>
@@ -1897,11 +2063,7 @@
         <w:t xml:space="preserve">, …, плотность вероятности пропорциональна длине вектора </w:t>
       </w:r>
       <w:r>
-        <w:rPr>
-          <w:rFonts w:cs="Times New Roman"/>
-          <w:sz w:val="28"/>
-          <w:lang w:val="ru-RU"/>
-        </w:rPr>
+        <w:rPr/>
       </w:r>
       <m:oMath xmlns:m="http://schemas.openxmlformats.org/officeDocument/2006/math">
         <m:r>
@@ -1920,11 +2082,7 @@
         <w:t xml:space="preserve"> – </w:t>
       </w:r>
       <w:r>
-        <w:rPr>
-          <w:rFonts w:cs="Times New Roman"/>
-          <w:sz w:val="28"/>
-          <w:lang w:val="ru-RU"/>
-        </w:rPr>
+        <w:rPr/>
       </w:r>
       <m:oMath xmlns:m="http://schemas.openxmlformats.org/officeDocument/2006/math">
         <m:r>
@@ -1943,11 +2101,7 @@
         <w:t xml:space="preserve">). Распределение симметрично относительно вектора </w:t>
       </w:r>
       <w:r>
-        <w:rPr>
-          <w:rFonts w:cs="Times New Roman"/>
-          <w:sz w:val="28"/>
-          <w:lang w:val="ru-RU"/>
-        </w:rPr>
+        <w:rPr/>
       </w:r>
       <m:oMath xmlns:m="http://schemas.openxmlformats.org/officeDocument/2006/math">
         <m:r>
@@ -1963,55 +2117,74 @@
           <w:sz w:val="28"/>
           <w:lang w:val="ru-RU"/>
         </w:rPr>
-        <w:t>. Число точек используемых в выборке 100000, число полученных направлений также 100000.</w:t>
-        <w:br/>
-      </w:r>
+        <w:t>. Число точек используемых в выборке 100000, число полученных направлений также 100000. Доказать, что полученное распределение косинусное и для всех выборок были сформированы направления.</w:t>
+      </w:r>
+    </w:p>
+    <w:p>
+      <w:pPr>
+        <w:pStyle w:val="BodyText"/>
+        <w:numPr>
+          <w:ilvl w:val="0"/>
+          <w:numId w:val="0"/>
+        </w:numPr>
+        <w:ind w:hanging="0" w:left="720"/>
+        <w:rPr>
+          <w:rFonts w:ascii="Times New Roman" w:hAnsi="Times New Roman" w:cs="Times New Roman"/>
+          <w:sz w:val="28"/>
+          <w:lang w:val="ru-RU"/>
+        </w:rPr>
+      </w:pPr>
       <w:r>
         <w:rPr>
           <w:rFonts w:cs="Times New Roman"/>
           <w:sz w:val="28"/>
           <w:lang w:val="ru-RU"/>
         </w:rPr>
-      </w:r>
-      <w:r>
-        <w:rPr>
-          <w:rFonts w:cs="Times New Roman"/>
-          <w:sz w:val="28"/>
-          <w:lang w:val="ru-RU"/>
-        </w:rPr>
-        <w:br/>
-        <w:t>Доказать, что полученное распределение косинусное и для всех выборок были сформированы направления.</w:t>
-      </w:r>
-      <w:r>
-        <w:br w:type="page"/>
-      </w:r>
-      <w:r>
         <mc:AlternateContent>
           <mc:Choice Requires="wps">
             <w:drawing>
-              <wp:inline distT="0" distB="0" distL="0" distR="0">
+              <wp:anchor distT="0" distB="0" distL="0" distR="0" simplePos="0" relativeHeight="15" behindDoc="0" locked="0" layoutInCell="0" allowOverlap="1">
+                <wp:simplePos x="0" y="0"/>
+                <wp:positionH relativeFrom="column">
+                  <wp:align>center</wp:align>
+                </wp:positionH>
+                <wp:positionV relativeFrom="paragraph">
+                  <wp:posOffset>635</wp:posOffset>
+                </wp:positionV>
                 <wp:extent cx="4109085" cy="3385185"/>
                 <wp:effectExtent l="0" t="0" r="0" b="0"/>
-                <wp:docPr id="13" name="Врезка7"/>
+                <wp:wrapSquare wrapText="largest"/>
+                <wp:docPr id="13" name="Врезка8"/>
                 <a:graphic xmlns:a="http://schemas.openxmlformats.org/drawingml/2006/main">
                   <a:graphicData uri="http://schemas.microsoft.com/office/word/2010/wordprocessingShape">
                     <wps:wsp>
-                      <wps:cNvSpPr txBox="1"/>
+                      <wps:cNvSpPr/>
                       <wps:spPr>
                         <a:xfrm>
                           <a:off x="0" y="0"/>
-                          <a:ext cx="4109085" cy="3385185"/>
+                          <a:ext cx="4109040" cy="3385080"/>
                         </a:xfrm>
-                        <a:prstGeom prst="rect"/>
+                        <a:prstGeom prst="rect">
+                          <a:avLst/>
+                        </a:prstGeom>
                         <a:solidFill>
-                          <a:srgbClr val="FFFFFF"/>
+                          <a:srgbClr val="ffffff"/>
                         </a:solidFill>
+                        <a:ln w="0">
+                          <a:noFill/>
+                        </a:ln>
                       </wps:spPr>
+                      <wps:style>
+                        <a:lnRef idx="0"/>
+                        <a:fillRef idx="0"/>
+                        <a:effectRef idx="0"/>
+                        <a:fontRef idx="minor"/>
+                      </wps:style>
                       <wps:txbx>
                         <w:txbxContent>
                           <w:p>
                             <w:pPr>
-                              <w:pStyle w:val="Style21"/>
+                              <w:pStyle w:val="user7"/>
                               <w:spacing w:before="120" w:after="120"/>
                               <w:rPr/>
                             </w:pPr>
@@ -2055,6 +2228,9 @@
                                   </a:graphic>
                                 </wp:inline>
                               </w:drawing>
+                            </w:r>
+                            <w:r>
+                              <w:rPr/>
                               <w:t xml:space="preserve">Рисунок </w:t>
                             </w:r>
                             <w:r>
@@ -2084,23 +2260,25 @@
                           </w:p>
                         </w:txbxContent>
                       </wps:txbx>
-                      <wps:bodyPr anchor="t" lIns="0" tIns="0" rIns="0" bIns="0">
+                      <wps:bodyPr lIns="0" rIns="0" tIns="0" bIns="0" anchor="t">
                         <a:noAutofit/>
                       </wps:bodyPr>
                     </wps:wsp>
                   </a:graphicData>
                 </a:graphic>
-              </wp:inline>
+              </wp:anchor>
             </w:drawing>
           </mc:Choice>
           <mc:Fallback>
             <w:pict>
-              <v:rect style="position:absolute;rotation:-0;width:323.55pt;height:266.55pt;mso-wrap-distance-left:0pt;mso-wrap-distance-right:0pt;mso-wrap-distance-top:0pt;mso-wrap-distance-bottom:0pt;margin-top:-266.55pt;mso-position-vertical:top;mso-position-vertical-relative:text;margin-left:0pt;mso-position-horizontal:center;mso-position-horizontal-relative:text">
-                <v:textbox inset="0in,0in,0in,0in">
+              <v:rect id="shape_0" fillcolor="white" stroked="f" o:allowincell="f" style="position:absolute;margin-left:72.05pt;margin-top:0.05pt;width:323.5pt;height:266.5pt;mso-wrap-style:square;v-text-anchor:top;mso-position-horizontal:center">
+                <v:fill o:detectmouseclick="t" type="solid" color2="black"/>
+                <v:stroke color="#3465a4" joinstyle="round" endcap="flat"/>
+                <v:textbox>
                   <w:txbxContent>
                     <w:p>
                       <w:pPr>
-                        <w:pStyle w:val="Style21"/>
+                        <w:pStyle w:val="user7"/>
                         <w:spacing w:before="120" w:after="120"/>
                         <w:rPr/>
                       </w:pPr>
@@ -2144,6 +2322,9 @@
                             </a:graphic>
                           </wp:inline>
                         </w:drawing>
+                      </w:r>
+                      <w:r>
+                        <w:rPr/>
                         <w:t xml:space="preserve">Рисунок </w:t>
                       </w:r>
                       <w:r>
@@ -2186,7 +2367,34 @@
         <w:spacing w:lineRule="auto" w:line="360" w:before="0" w:after="0"/>
         <w:ind w:left="709"/>
         <w:jc w:val="center"/>
-        <w:rPr/>
+        <w:rPr>
+          <w:rFonts w:eastAsia="Times New Roman" w:cs="Times New Roman"/>
+          <w:bCs/>
+          <w:color w:val="auto"/>
+        </w:rPr>
+      </w:pPr>
+      <w:r>
+        <w:rPr>
+          <w:rFonts w:eastAsia="Times New Roman" w:cs="Times New Roman"/>
+          <w:bCs/>
+          <w:color w:val="auto"/>
+        </w:rPr>
+      </w:r>
+      <w:r>
+        <w:br w:type="page"/>
+      </w:r>
+    </w:p>
+    <w:p>
+      <w:pPr>
+        <w:pStyle w:val="Heading1"/>
+        <w:spacing w:lineRule="auto" w:line="360" w:before="0" w:after="0"/>
+        <w:ind w:left="709"/>
+        <w:jc w:val="center"/>
+        <w:rPr>
+          <w:rFonts w:eastAsia="Times New Roman" w:cs="Times New Roman"/>
+          <w:bCs/>
+          <w:color w:val="auto"/>
+        </w:rPr>
       </w:pPr>
       <w:bookmarkStart w:id="3" w:name="__RefHeading___Toc522_1614521587_Копия_4"/>
       <w:bookmarkStart w:id="4" w:name="_Toc213488756"/>
@@ -2216,13 +2424,7 @@
           <w:rPr>
             <w:rStyle w:val="Hyperlink"/>
           </w:rPr>
-          <w:t>https://github.com/vvlaads/Image-Processing-</w:t>
-        </w:r>
-        <w:r>
-          <w:rPr>
-            <w:rStyle w:val="Hyperlink"/>
-          </w:rPr>
-          <w:t>3</w:t>
+          <w:t>https://github.com/vvlaads/Image-Processing-3</w:t>
         </w:r>
       </w:hyperlink>
       <w:r>
@@ -2491,7 +2693,7 @@
           </w:r>
           <w:r>
             <w:rPr/>
-            <w:t>9</w:t>
+            <w:t>10</w:t>
           </w:r>
           <w:r>
             <w:rPr/>
@@ -3843,20 +4045,20 @@
     <w:qFormat/>
     <w:rPr/>
   </w:style>
-  <w:style w:type="character" w:styleId="Style13" w:customStyle="1">
-    <w:name w:val="Ссылка указателя"/>
+  <w:style w:type="character" w:styleId="user" w:customStyle="1">
+    <w:name w:val="Ссылка указателя (user)"/>
     <w:qFormat/>
     <w:rPr/>
   </w:style>
-  <w:style w:type="character" w:styleId="Style14" w:customStyle="1">
-    <w:name w:val="Маркеры"/>
+  <w:style w:type="character" w:styleId="user1" w:customStyle="1">
+    <w:name w:val="Маркеры (user)"/>
     <w:qFormat/>
     <w:rPr>
       <w:rFonts w:ascii="OpenSymbol" w:hAnsi="OpenSymbol" w:eastAsia="OpenSymbol" w:cs="OpenSymbol"/>
     </w:rPr>
   </w:style>
-  <w:style w:type="character" w:styleId="Style15" w:customStyle="1">
-    <w:name w:val="Символ нумерации"/>
+  <w:style w:type="character" w:styleId="user2" w:customStyle="1">
+    <w:name w:val="Символ нумерации (user)"/>
     <w:qFormat/>
     <w:rPr>
       <w:rFonts w:ascii="Times New Roman" w:hAnsi="Times New Roman"/>
@@ -3881,19 +4083,19 @@
       <w:u w:val="single"/>
     </w:rPr>
   </w:style>
-  <w:style w:type="character" w:styleId="Style16" w:customStyle="1">
-    <w:name w:val="Исходный текст"/>
+  <w:style w:type="character" w:styleId="user3" w:customStyle="1">
+    <w:name w:val="Исходный текст (user)"/>
     <w:qFormat/>
     <w:rPr>
       <w:rFonts w:ascii="Liberation Mono" w:hAnsi="Liberation Mono" w:eastAsia="Liberation Mono" w:cs="Liberation Mono"/>
     </w:rPr>
   </w:style>
-  <w:style w:type="character" w:styleId="user">
-    <w:name w:val="Символ нумерации (user)"/>
+  <w:style w:type="character" w:styleId="Style13">
+    <w:name w:val="Символ нумерации"/>
     <w:qFormat/>
     <w:rPr/>
   </w:style>
-  <w:style w:type="paragraph" w:styleId="Style17">
+  <w:style w:type="paragraph" w:styleId="Style14">
     <w:name w:val="Заголовок"/>
     <w:basedOn w:val="Normal"/>
     <w:next w:val="BodyText"/>
@@ -3903,7 +4105,7 @@
       <w:spacing w:before="240" w:after="120"/>
     </w:pPr>
     <w:rPr>
-      <w:rFonts w:ascii="Liberation Sans" w:hAnsi="Liberation Sans" w:eastAsia="Microsoft YaHei" w:cs="Lucida Sans"/>
+      <w:rFonts w:ascii="Liberation Sans" w:hAnsi="Liberation Sans" w:eastAsia="Microsoft YaHei" w:cs="Arial"/>
       <w:sz w:val="28"/>
       <w:szCs w:val="28"/>
     </w:rPr>
@@ -3942,7 +4144,7 @@
       <w:szCs w:val="24"/>
     </w:rPr>
   </w:style>
-  <w:style w:type="paragraph" w:styleId="Style18">
+  <w:style w:type="paragraph" w:styleId="Style15">
     <w:name w:val="Указатель"/>
     <w:basedOn w:val="Normal"/>
     <w:qFormat/>
@@ -3950,10 +4152,10 @@
       <w:suppressLineNumbers/>
     </w:pPr>
     <w:rPr>
-      <w:rFonts w:cs="Lucida Sans"/>
+      <w:rFonts w:cs="Arial"/>
     </w:rPr>
   </w:style>
-  <w:style w:type="paragraph" w:styleId="user1">
+  <w:style w:type="paragraph" w:styleId="user4">
     <w:name w:val="Заголовок (user)"/>
     <w:basedOn w:val="Normal"/>
     <w:next w:val="BodyText"/>
@@ -3963,12 +4165,12 @@
       <w:spacing w:before="240" w:after="120"/>
     </w:pPr>
     <w:rPr>
-      <w:rFonts w:ascii="Liberation Sans" w:hAnsi="Liberation Sans" w:eastAsia="Microsoft YaHei" w:cs="Arial"/>
+      <w:rFonts w:ascii="Liberation Sans" w:hAnsi="Liberation Sans" w:eastAsia="Microsoft YaHei" w:cs="Lucida Sans"/>
       <w:sz w:val="28"/>
       <w:szCs w:val="28"/>
     </w:rPr>
   </w:style>
-  <w:style w:type="paragraph" w:styleId="user2">
+  <w:style w:type="paragraph" w:styleId="user5">
     <w:name w:val="Указатель (user)"/>
     <w:basedOn w:val="Normal"/>
     <w:qFormat/>
@@ -3976,7 +4178,7 @@
       <w:suppressLineNumbers/>
     </w:pPr>
     <w:rPr>
-      <w:rFonts w:cs="Arial"/>
+      <w:rFonts w:cs="Lucida Sans"/>
     </w:rPr>
   </w:style>
   <w:style w:type="paragraph" w:styleId="Title">
@@ -4091,22 +4293,22 @@
     </w:pPr>
     <w:rPr/>
   </w:style>
-  <w:style w:type="paragraph" w:styleId="Style19" w:customStyle="1">
+  <w:style w:type="paragraph" w:styleId="Style16" w:customStyle="1">
     <w:name w:val="Колонтитул"/>
     <w:basedOn w:val="Normal"/>
     <w:qFormat/>
     <w:pPr/>
     <w:rPr/>
   </w:style>
-  <w:style w:type="paragraph" w:styleId="Style20" w:customStyle="1">
-    <w:name w:val="Колонтитулы"/>
+  <w:style w:type="paragraph" w:styleId="user6" w:customStyle="1">
+    <w:name w:val="Колонтитулы (user)"/>
     <w:basedOn w:val="Normal"/>
     <w:qFormat/>
     <w:pPr/>
     <w:rPr/>
   </w:style>
-  <w:style w:type="paragraph" w:styleId="user3">
-    <w:name w:val="Колонтитулы (user)"/>
+  <w:style w:type="paragraph" w:styleId="Style17">
+    <w:name w:val="Колонтитулы"/>
     <w:basedOn w:val="Normal"/>
     <w:qFormat/>
     <w:pPr/>
@@ -4165,7 +4367,7 @@
   </w:style>
   <w:style w:type="paragraph" w:styleId="IndexHeading">
     <w:name w:val="index heading"/>
-    <w:basedOn w:val="Style17"/>
+    <w:basedOn w:val="user4"/>
     <w:pPr/>
     <w:rPr/>
   </w:style>
@@ -4185,8 +4387,8 @@
       <w:lang w:val="en-US"/>
     </w:rPr>
   </w:style>
-  <w:style w:type="paragraph" w:styleId="Style21" w:customStyle="1">
-    <w:name w:val="Рисунок"/>
+  <w:style w:type="paragraph" w:styleId="user7" w:customStyle="1">
+    <w:name w:val="Рисунок (user)"/>
     <w:basedOn w:val="caption1111"/>
     <w:qFormat/>
     <w:pPr/>
@@ -4197,15 +4399,15 @@
       <w:szCs w:val="28"/>
     </w:rPr>
   </w:style>
-  <w:style w:type="paragraph" w:styleId="Style22" w:customStyle="1">
-    <w:name w:val="Содержимое врезки"/>
+  <w:style w:type="paragraph" w:styleId="user8" w:customStyle="1">
+    <w:name w:val="Содержимое врезки (user)"/>
     <w:basedOn w:val="Normal"/>
     <w:qFormat/>
     <w:pPr/>
     <w:rPr/>
   </w:style>
-  <w:style w:type="paragraph" w:styleId="Style23" w:customStyle="1">
-    <w:name w:val="Содержимое таблицы"/>
+  <w:style w:type="paragraph" w:styleId="user9" w:customStyle="1">
+    <w:name w:val="Содержимое таблицы (user)"/>
     <w:basedOn w:val="Normal"/>
     <w:qFormat/>
     <w:pPr>
@@ -4214,9 +4416,9 @@
     </w:pPr>
     <w:rPr/>
   </w:style>
-  <w:style w:type="paragraph" w:styleId="Style24" w:customStyle="1">
-    <w:name w:val="Заголовок таблицы"/>
-    <w:basedOn w:val="Style23"/>
+  <w:style w:type="paragraph" w:styleId="user10" w:customStyle="1">
+    <w:name w:val="Заголовок таблицы (user)"/>
+    <w:basedOn w:val="user9"/>
     <w:qFormat/>
     <w:pPr>
       <w:jc w:val="center"/>
@@ -4226,14 +4428,14 @@
       <w:bCs/>
     </w:rPr>
   </w:style>
-  <w:style w:type="paragraph" w:styleId="Style25" w:customStyle="1">
-    <w:name w:val="Фигура"/>
+  <w:style w:type="paragraph" w:styleId="user11" w:customStyle="1">
+    <w:name w:val="Фигура (user)"/>
     <w:basedOn w:val="caption1111"/>
     <w:qFormat/>
     <w:pPr/>
     <w:rPr/>
   </w:style>
-  <w:style w:type="paragraph" w:styleId="Style26" w:customStyle="1">
+  <w:style w:type="paragraph" w:styleId="Style18" w:customStyle="1">
     <w:name w:val="График"/>
     <w:basedOn w:val="caption1111"/>
     <w:qFormat/>
@@ -4265,22 +4467,29 @@
     </w:pPr>
     <w:rPr/>
   </w:style>
-  <w:style w:type="paragraph" w:styleId="user4">
-    <w:name w:val="Содержимое врезки (user)"/>
+  <w:style w:type="paragraph" w:styleId="Style19">
+    <w:name w:val="Содержимое врезки"/>
     <w:basedOn w:val="Normal"/>
     <w:qFormat/>
     <w:pPr/>
     <w:rPr/>
   </w:style>
-  <w:style w:type="numbering" w:styleId="user5" w:default="1">
-    <w:name w:val="Без списка (user)"/>
+  <w:style w:type="paragraph" w:styleId="Style20">
+    <w:name w:val="Рисунок"/>
+    <w:basedOn w:val="Caption"/>
+    <w:qFormat/>
+    <w:pPr/>
+    <w:rPr/>
+  </w:style>
+  <w:style w:type="numbering" w:styleId="Style21" w:default="1">
+    <w:name w:val="Без списка"/>
     <w:uiPriority w:val="99"/>
     <w:semiHidden/>
     <w:unhideWhenUsed/>
     <w:qFormat/>
   </w:style>
-  <w:style w:type="numbering" w:styleId="Style27" w:customStyle="1">
-    <w:name w:val="Без списка"/>
+  <w:style w:type="numbering" w:styleId="user12" w:customStyle="1">
+    <w:name w:val="Без списка (user)"/>
     <w:uiPriority w:val="99"/>
     <w:semiHidden/>
     <w:unhideWhenUsed/>

</xml_diff>

<commit_message>
Added proofs for first task
</commit_message>
<xml_diff>
--- a/docs/Силинцев Владислав Лаб 3 P3314.docx
+++ b/docs/Силинцев Владислав Лаб 3 P3314.docx
@@ -1,6 +1,6 @@
 
 <file path=word/document.xml><?xml version="1.0" encoding="utf-8"?>
-<w:document xmlns:o="urn:schemas-microsoft-com:office:office" xmlns:r="http://schemas.openxmlformats.org/officeDocument/2006/relationships" xmlns:v="urn:schemas-microsoft-com:vml" xmlns:w="http://schemas.openxmlformats.org/wordprocessingml/2006/main" xmlns:w10="urn:schemas-microsoft-com:office:word" xmlns:wp="http://schemas.openxmlformats.org/drawingml/2006/wordprocessingDrawing" xmlns:pic="http://schemas.openxmlformats.org/drawingml/2006/picture" xmlns:wps="http://schemas.microsoft.com/office/word/2010/wordprocessingShape" xmlns:wpg="http://schemas.microsoft.com/office/word/2010/wordprocessingGroup" xmlns:mc="http://schemas.openxmlformats.org/markup-compatibility/2006" xmlns:wp14="http://schemas.microsoft.com/office/word/2010/wordprocessingDrawing" xmlns:w14="http://schemas.microsoft.com/office/word/2010/wordml" xmlns:w15="http://schemas.microsoft.com/office/word/2012/wordml" mc:Ignorable="w14 wp14 w15">
+<w:document xmlns:o="urn:schemas-microsoft-com:office:office" xmlns:r="http://schemas.openxmlformats.org/officeDocument/2006/relationships" xmlns:v="urn:schemas-microsoft-com:vml" xmlns:w="http://schemas.openxmlformats.org/wordprocessingml/2006/main" xmlns:w10="urn:schemas-microsoft-com:office:word" xmlns:wp="http://schemas.openxmlformats.org/drawingml/2006/wordprocessingDrawing" xmlns:wps="http://schemas.microsoft.com/office/word/2010/wordprocessingShape" xmlns:wpg="http://schemas.microsoft.com/office/word/2010/wordprocessingGroup" xmlns:mc="http://schemas.openxmlformats.org/markup-compatibility/2006" xmlns:wp14="http://schemas.microsoft.com/office/word/2010/wordprocessingDrawing" xmlns:w14="http://schemas.microsoft.com/office/word/2010/wordml" xmlns:w15="http://schemas.microsoft.com/office/word/2012/wordml" mc:Ignorable="w14 wp14 w15">
   <w:body>
     <w:p>
       <w:pPr>
@@ -14,7 +14,7 @@
         <mc:AlternateContent>
           <mc:Choice Requires="wps">
             <w:drawing>
-              <wp:anchor distT="0" distB="0" distL="0" distR="0" simplePos="0" relativeHeight="2" behindDoc="0" locked="0" layoutInCell="1" allowOverlap="1">
+              <wp:anchor behindDoc="0" distT="0" distB="0" distL="0" distR="0" simplePos="0" locked="0" layoutInCell="1" allowOverlap="1" relativeHeight="2">
                 <wp:simplePos x="0" y="0"/>
                 <wp:positionH relativeFrom="column">
                   <wp:posOffset>-213360</wp:posOffset>
@@ -78,7 +78,7 @@
           </mc:Choice>
           <mc:Fallback>
             <w:pict>
-              <v:rect id="shape_0" stroked="f" o:allowincell="f" style="position:absolute;margin-left:-16.8pt;margin-top:0.05pt;width:16.75pt;height:16.75pt;mso-wrap-style:none;v-text-anchor:middle">
+              <v:rect id="shape_0" ID="Врезка1" path="m0,0l-2147483645,0l-2147483645,-2147483646l0,-2147483646xe" stroked="f" o:allowincell="f" style="position:absolute;margin-left:-16.8pt;margin-top:0.05pt;width:16.75pt;height:16.75pt;mso-wrap-style:none;v-text-anchor:middle">
                 <v:fill o:detectmouseclick="t" on="false"/>
                 <v:stroke color="#3465a4" joinstyle="round" endcap="flat"/>
                 <v:textbox>
@@ -107,7 +107,7 @@
         <mc:AlternateContent>
           <mc:Choice Requires="wps">
             <w:drawing>
-              <wp:anchor distT="0" distB="0" distL="0" distR="0" simplePos="0" relativeHeight="4" behindDoc="0" locked="0" layoutInCell="1" allowOverlap="1">
+              <wp:anchor behindDoc="0" distT="0" distB="0" distL="0" distR="0" simplePos="0" locked="0" layoutInCell="1" allowOverlap="1" relativeHeight="4">
                 <wp:simplePos x="0" y="0"/>
                 <wp:positionH relativeFrom="column">
                   <wp:posOffset>-213360</wp:posOffset>
@@ -171,7 +171,7 @@
           </mc:Choice>
           <mc:Fallback>
             <w:pict>
-              <v:rect id="shape_0" stroked="f" o:allowincell="f" style="position:absolute;margin-left:-16.8pt;margin-top:0.05pt;width:16.75pt;height:16.75pt;mso-wrap-style:none;v-text-anchor:middle">
+              <v:rect id="shape_0" ID="Врезка2" path="m0,0l-2147483645,0l-2147483645,-2147483646l0,-2147483646xe" stroked="f" o:allowincell="f" style="position:absolute;margin-left:-16.8pt;margin-top:0.05pt;width:16.75pt;height:16.75pt;mso-wrap-style:none;v-text-anchor:middle">
                 <v:fill o:detectmouseclick="t" on="false"/>
                 <v:stroke color="#3465a4" joinstyle="round" endcap="flat"/>
                 <v:textbox>
@@ -200,7 +200,7 @@
         <mc:AlternateContent>
           <mc:Choice Requires="wps">
             <w:drawing>
-              <wp:anchor distT="0" distB="0" distL="0" distR="0" simplePos="0" relativeHeight="6" behindDoc="0" locked="0" layoutInCell="1" allowOverlap="1">
+              <wp:anchor behindDoc="0" distT="0" distB="0" distL="0" distR="0" simplePos="0" locked="0" layoutInCell="1" allowOverlap="1" relativeHeight="6">
                 <wp:simplePos x="0" y="0"/>
                 <wp:positionH relativeFrom="column">
                   <wp:posOffset>-213360</wp:posOffset>
@@ -264,7 +264,7 @@
           </mc:Choice>
           <mc:Fallback>
             <w:pict>
-              <v:rect id="shape_0" stroked="f" o:allowincell="f" style="position:absolute;margin-left:-16.8pt;margin-top:0.05pt;width:16.75pt;height:16.75pt;mso-wrap-style:none;v-text-anchor:middle">
+              <v:rect id="shape_0" ID="Врезка3" path="m0,0l-2147483645,0l-2147483645,-2147483646l0,-2147483646xe" stroked="f" o:allowincell="f" style="position:absolute;margin-left:-16.8pt;margin-top:0.05pt;width:16.75pt;height:16.75pt;mso-wrap-style:none;v-text-anchor:middle">
                 <v:fill o:detectmouseclick="t" on="false"/>
                 <v:stroke color="#3465a4" joinstyle="round" endcap="flat"/>
                 <v:textbox>
@@ -897,7 +897,7 @@
         <mc:AlternateContent>
           <mc:Choice Requires="wps">
             <w:drawing>
-              <wp:anchor distT="0" distB="0" distL="0" distR="0" simplePos="0" relativeHeight="8" behindDoc="0" locked="0" layoutInCell="0" allowOverlap="1">
+              <wp:anchor behindDoc="0" distT="0" distB="0" distL="0" distR="0" simplePos="0" locked="0" layoutInCell="0" allowOverlap="1" relativeHeight="8">
                 <wp:simplePos x="0" y="0"/>
                 <wp:positionH relativeFrom="column">
                   <wp:align>center</wp:align>
@@ -938,17 +938,29 @@
                         <w:txbxContent>
                           <w:p>
                             <w:pPr>
-                              <w:pStyle w:val="user7"/>
+                              <w:pStyle w:val="Style21"/>
                               <w:spacing w:before="120" w:after="120"/>
-                              <w:rPr/>
+                              <w:rPr>
+                                <w:i w:val="false"/>
+                                <w:i w:val="false"/>
+                                <w:iCs w:val="false"/>
+                                <w:sz w:val="28"/>
+                                <w:szCs w:val="28"/>
+                              </w:rPr>
                             </w:pPr>
                             <w:r>
-                              <w:rPr/>
+                              <w:rPr>
+                                <w:i w:val="false"/>
+                                <w:iCs w:val="false"/>
+                                <w:color w:val="000000"/>
+                                <w:sz w:val="28"/>
+                                <w:szCs w:val="28"/>
+                              </w:rPr>
                               <w:drawing>
                                 <wp:inline distT="0" distB="0" distL="0" distR="0">
                                   <wp:extent cx="3888740" cy="2468245"/>
                                   <wp:effectExtent l="0" t="0" r="0" b="0"/>
-                                  <wp:docPr id="5" name="Picture 1"/>
+                                  <wp:docPr id="6" name="Picture 1" descr=""/>
                                   <wp:cNvGraphicFramePr>
                                     <a:graphicFrameLocks xmlns:a="http://schemas.openxmlformats.org/drawingml/2006/main" noChangeAspect="1"/>
                                   </wp:cNvGraphicFramePr>
@@ -956,7 +968,7 @@
                                     <a:graphicData uri="http://schemas.openxmlformats.org/drawingml/2006/picture">
                                       <pic:pic xmlns:pic="http://schemas.openxmlformats.org/drawingml/2006/picture">
                                         <pic:nvPicPr>
-                                          <pic:cNvPr id="5" name="Picture 1"/>
+                                          <pic:cNvPr id="6" name="Picture 1" descr=""/>
                                           <pic:cNvPicPr>
                                             <a:picLocks noChangeAspect="1" noChangeArrowheads="1"/>
                                           </pic:cNvPicPr>
@@ -975,7 +987,6 @@
                                           <a:prstGeom prst="rect">
                                             <a:avLst/>
                                           </a:prstGeom>
-                                          <a:noFill/>
                                         </pic:spPr>
                                       </pic:pic>
                                     </a:graphicData>
@@ -984,31 +995,73 @@
                               </w:drawing>
                             </w:r>
                             <w:r>
-                              <w:rPr/>
+                              <w:rPr>
+                                <w:i w:val="false"/>
+                                <w:iCs w:val="false"/>
+                                <w:color w:val="000000"/>
+                                <w:sz w:val="28"/>
+                                <w:szCs w:val="28"/>
+                              </w:rPr>
                               <w:t xml:space="preserve">Рисунок </w:t>
                             </w:r>
                             <w:r>
-                              <w:rPr/>
+                              <w:rPr>
+                                <w:i w:val="false"/>
+                                <w:iCs w:val="false"/>
+                                <w:color w:val="000000"/>
+                                <w:sz w:val="28"/>
+                                <w:szCs w:val="28"/>
+                              </w:rPr>
                               <w:fldChar w:fldCharType="begin"/>
                             </w:r>
                             <w:r>
-                              <w:rPr/>
+                              <w:rPr>
+                                <w:sz w:val="28"/>
+                                <w:i w:val="false"/>
+                                <w:szCs w:val="28"/>
+                                <w:iCs w:val="false"/>
+                                <w:color w:val="000000"/>
+                              </w:rPr>
                               <w:instrText xml:space="preserve"> SEQ Рисунок \* ARABIC </w:instrText>
                             </w:r>
                             <w:r>
-                              <w:rPr/>
+                              <w:rPr>
+                                <w:sz w:val="28"/>
+                                <w:i w:val="false"/>
+                                <w:szCs w:val="28"/>
+                                <w:iCs w:val="false"/>
+                                <w:color w:val="000000"/>
+                              </w:rPr>
                               <w:fldChar w:fldCharType="separate"/>
                             </w:r>
                             <w:r>
-                              <w:rPr/>
+                              <w:rPr>
+                                <w:sz w:val="28"/>
+                                <w:i w:val="false"/>
+                                <w:szCs w:val="28"/>
+                                <w:iCs w:val="false"/>
+                                <w:color w:val="000000"/>
+                              </w:rPr>
                               <w:t>1</w:t>
                             </w:r>
                             <w:r>
-                              <w:rPr/>
+                              <w:rPr>
+                                <w:sz w:val="28"/>
+                                <w:i w:val="false"/>
+                                <w:szCs w:val="28"/>
+                                <w:iCs w:val="false"/>
+                                <w:color w:val="000000"/>
+                              </w:rPr>
                               <w:fldChar w:fldCharType="end"/>
                             </w:r>
                             <w:r>
-                              <w:rPr/>
+                              <w:rPr>
+                                <w:i w:val="false"/>
+                                <w:iCs w:val="false"/>
+                                <w:color w:val="000000"/>
+                                <w:sz w:val="28"/>
+                                <w:szCs w:val="28"/>
+                              </w:rPr>
                               <w:t>: Равномерное распределение в треугольнике</w:t>
                             </w:r>
                           </w:p>
@@ -1025,24 +1078,36 @@
           </mc:Choice>
           <mc:Fallback>
             <w:pict>
-              <v:rect id="shape_0" fillcolor="white" stroked="f" o:allowincell="f" style="position:absolute;margin-left:80.75pt;margin-top:0.05pt;width:306.15pt;height:241pt;mso-wrap-style:square;v-text-anchor:top;mso-position-horizontal:center">
+              <v:rect id="shape_0" ID="Врезка4" path="m0,0l-2147483645,0l-2147483645,-2147483646l0,-2147483646xe" fillcolor="white" stroked="f" o:allowincell="f" style="position:absolute;margin-left:80.75pt;margin-top:0.05pt;width:306.15pt;height:241pt;mso-wrap-style:square;v-text-anchor:top;mso-position-horizontal:center">
                 <v:fill o:detectmouseclick="t" type="solid" color2="black"/>
                 <v:stroke color="#3465a4" joinstyle="round" endcap="flat"/>
                 <v:textbox>
                   <w:txbxContent>
                     <w:p>
                       <w:pPr>
-                        <w:pStyle w:val="user7"/>
+                        <w:pStyle w:val="Style21"/>
                         <w:spacing w:before="120" w:after="120"/>
-                        <w:rPr/>
+                        <w:rPr>
+                          <w:i w:val="false"/>
+                          <w:i w:val="false"/>
+                          <w:iCs w:val="false"/>
+                          <w:sz w:val="28"/>
+                          <w:szCs w:val="28"/>
+                        </w:rPr>
                       </w:pPr>
                       <w:r>
-                        <w:rPr/>
+                        <w:rPr>
+                          <w:i w:val="false"/>
+                          <w:iCs w:val="false"/>
+                          <w:color w:val="000000"/>
+                          <w:sz w:val="28"/>
+                          <w:szCs w:val="28"/>
+                        </w:rPr>
                         <w:drawing>
                           <wp:inline distT="0" distB="0" distL="0" distR="0">
                             <wp:extent cx="3888740" cy="2468245"/>
                             <wp:effectExtent l="0" t="0" r="0" b="0"/>
-                            <wp:docPr id="6" name="Picture 1"/>
+                            <wp:docPr id="7" name="Picture 1" descr=""/>
                             <wp:cNvGraphicFramePr>
                               <a:graphicFrameLocks xmlns:a="http://schemas.openxmlformats.org/drawingml/2006/main" noChangeAspect="1"/>
                             </wp:cNvGraphicFramePr>
@@ -1050,7 +1115,7 @@
                               <a:graphicData uri="http://schemas.openxmlformats.org/drawingml/2006/picture">
                                 <pic:pic xmlns:pic="http://schemas.openxmlformats.org/drawingml/2006/picture">
                                   <pic:nvPicPr>
-                                    <pic:cNvPr id="6" name="Picture 1"/>
+                                    <pic:cNvPr id="7" name="Picture 1" descr=""/>
                                     <pic:cNvPicPr>
                                       <a:picLocks noChangeAspect="1" noChangeArrowheads="1"/>
                                     </pic:cNvPicPr>
@@ -1069,7 +1134,6 @@
                                     <a:prstGeom prst="rect">
                                       <a:avLst/>
                                     </a:prstGeom>
-                                    <a:noFill/>
                                   </pic:spPr>
                                 </pic:pic>
                               </a:graphicData>
@@ -1078,31 +1142,73 @@
                         </w:drawing>
                       </w:r>
                       <w:r>
-                        <w:rPr/>
+                        <w:rPr>
+                          <w:i w:val="false"/>
+                          <w:iCs w:val="false"/>
+                          <w:color w:val="000000"/>
+                          <w:sz w:val="28"/>
+                          <w:szCs w:val="28"/>
+                        </w:rPr>
                         <w:t xml:space="preserve">Рисунок </w:t>
                       </w:r>
                       <w:r>
-                        <w:rPr/>
+                        <w:rPr>
+                          <w:i w:val="false"/>
+                          <w:iCs w:val="false"/>
+                          <w:color w:val="000000"/>
+                          <w:sz w:val="28"/>
+                          <w:szCs w:val="28"/>
+                        </w:rPr>
                         <w:fldChar w:fldCharType="begin"/>
                       </w:r>
                       <w:r>
-                        <w:rPr/>
+                        <w:rPr>
+                          <w:sz w:val="28"/>
+                          <w:i w:val="false"/>
+                          <w:szCs w:val="28"/>
+                          <w:iCs w:val="false"/>
+                          <w:color w:val="000000"/>
+                        </w:rPr>
                         <w:instrText xml:space="preserve"> SEQ Рисунок \* ARABIC </w:instrText>
                       </w:r>
                       <w:r>
-                        <w:rPr/>
+                        <w:rPr>
+                          <w:sz w:val="28"/>
+                          <w:i w:val="false"/>
+                          <w:szCs w:val="28"/>
+                          <w:iCs w:val="false"/>
+                          <w:color w:val="000000"/>
+                        </w:rPr>
                         <w:fldChar w:fldCharType="separate"/>
                       </w:r>
                       <w:r>
-                        <w:rPr/>
+                        <w:rPr>
+                          <w:sz w:val="28"/>
+                          <w:i w:val="false"/>
+                          <w:szCs w:val="28"/>
+                          <w:iCs w:val="false"/>
+                          <w:color w:val="000000"/>
+                        </w:rPr>
                         <w:t>1</w:t>
                       </w:r>
                       <w:r>
-                        <w:rPr/>
+                        <w:rPr>
+                          <w:sz w:val="28"/>
+                          <w:i w:val="false"/>
+                          <w:szCs w:val="28"/>
+                          <w:iCs w:val="false"/>
+                          <w:color w:val="000000"/>
+                        </w:rPr>
                         <w:fldChar w:fldCharType="end"/>
                       </w:r>
                       <w:r>
-                        <w:rPr/>
+                        <w:rPr>
+                          <w:i w:val="false"/>
+                          <w:iCs w:val="false"/>
+                          <w:color w:val="000000"/>
+                          <w:sz w:val="28"/>
+                          <w:szCs w:val="28"/>
+                        </w:rPr>
                         <w:t>: Равномерное распределение в треугольнике</w:t>
                       </w:r>
                     </w:p>
@@ -1308,7 +1414,7 @@
         <mc:AlternateContent>
           <mc:Choice Requires="wps">
             <w:drawing>
-              <wp:anchor distT="0" distB="0" distL="0" distR="0" simplePos="0" relativeHeight="10" behindDoc="0" locked="0" layoutInCell="0" allowOverlap="1">
+              <wp:anchor behindDoc="0" distT="0" distB="0" distL="0" distR="0" simplePos="0" locked="0" layoutInCell="0" allowOverlap="1" relativeHeight="10">
                 <wp:simplePos x="0" y="0"/>
                 <wp:positionH relativeFrom="column">
                   <wp:align>center</wp:align>
@@ -1319,7 +1425,7 @@
                 <wp:extent cx="3827780" cy="2915285"/>
                 <wp:effectExtent l="0" t="0" r="0" b="0"/>
                 <wp:wrapSquare wrapText="largest"/>
-                <wp:docPr id="7" name="Врезка5"/>
+                <wp:docPr id="5" name="Врезка5"/>
                 <a:graphic xmlns:a="http://schemas.openxmlformats.org/drawingml/2006/main">
                   <a:graphicData uri="http://schemas.microsoft.com/office/word/2010/wordprocessingShape">
                     <wps:wsp>
@@ -1349,17 +1455,29 @@
                         <w:txbxContent>
                           <w:p>
                             <w:pPr>
-                              <w:pStyle w:val="user7"/>
+                              <w:pStyle w:val="Style21"/>
                               <w:spacing w:before="120" w:after="120"/>
-                              <w:rPr/>
+                              <w:rPr>
+                                <w:i w:val="false"/>
+                                <w:i w:val="false"/>
+                                <w:iCs w:val="false"/>
+                                <w:sz w:val="28"/>
+                                <w:szCs w:val="28"/>
+                              </w:rPr>
                             </w:pPr>
                             <w:r>
-                              <w:rPr/>
+                              <w:rPr>
+                                <w:i w:val="false"/>
+                                <w:iCs w:val="false"/>
+                                <w:color w:val="000000"/>
+                                <w:sz w:val="28"/>
+                                <w:szCs w:val="28"/>
+                              </w:rPr>
                               <w:drawing>
                                 <wp:inline distT="0" distB="0" distL="0" distR="0">
                                   <wp:extent cx="3827780" cy="2322195"/>
                                   <wp:effectExtent l="0" t="0" r="0" b="0"/>
-                                  <wp:docPr id="8" name="Picture 4"/>
+                                  <wp:docPr id="7" name="Picture 4" descr=""/>
                                   <wp:cNvGraphicFramePr>
                                     <a:graphicFrameLocks xmlns:a="http://schemas.openxmlformats.org/drawingml/2006/main" noChangeAspect="1"/>
                                   </wp:cNvGraphicFramePr>
@@ -1367,7 +1485,7 @@
                                     <a:graphicData uri="http://schemas.openxmlformats.org/drawingml/2006/picture">
                                       <pic:pic xmlns:pic="http://schemas.openxmlformats.org/drawingml/2006/picture">
                                         <pic:nvPicPr>
-                                          <pic:cNvPr id="8" name="Picture 4"/>
+                                          <pic:cNvPr id="7" name="Picture 4" descr=""/>
                                           <pic:cNvPicPr>
                                             <a:picLocks noChangeAspect="1" noChangeArrowheads="1"/>
                                           </pic:cNvPicPr>
@@ -1386,7 +1504,6 @@
                                           <a:prstGeom prst="rect">
                                             <a:avLst/>
                                           </a:prstGeom>
-                                          <a:noFill/>
                                         </pic:spPr>
                                       </pic:pic>
                                     </a:graphicData>
@@ -1395,31 +1512,73 @@
                               </w:drawing>
                             </w:r>
                             <w:r>
-                              <w:rPr/>
+                              <w:rPr>
+                                <w:i w:val="false"/>
+                                <w:iCs w:val="false"/>
+                                <w:color w:val="000000"/>
+                                <w:sz w:val="28"/>
+                                <w:szCs w:val="28"/>
+                              </w:rPr>
                               <w:t xml:space="preserve">Рисунок </w:t>
                             </w:r>
                             <w:r>
-                              <w:rPr/>
+                              <w:rPr>
+                                <w:i w:val="false"/>
+                                <w:iCs w:val="false"/>
+                                <w:color w:val="000000"/>
+                                <w:sz w:val="28"/>
+                                <w:szCs w:val="28"/>
+                              </w:rPr>
                               <w:fldChar w:fldCharType="begin"/>
                             </w:r>
                             <w:r>
-                              <w:rPr/>
+                              <w:rPr>
+                                <w:sz w:val="28"/>
+                                <w:i w:val="false"/>
+                                <w:szCs w:val="28"/>
+                                <w:iCs w:val="false"/>
+                                <w:color w:val="000000"/>
+                              </w:rPr>
                               <w:instrText xml:space="preserve"> SEQ Рисунок \* ARABIC </w:instrText>
                             </w:r>
                             <w:r>
-                              <w:rPr/>
+                              <w:rPr>
+                                <w:sz w:val="28"/>
+                                <w:i w:val="false"/>
+                                <w:szCs w:val="28"/>
+                                <w:iCs w:val="false"/>
+                                <w:color w:val="000000"/>
+                              </w:rPr>
                               <w:fldChar w:fldCharType="separate"/>
                             </w:r>
                             <w:r>
-                              <w:rPr/>
+                              <w:rPr>
+                                <w:sz w:val="28"/>
+                                <w:i w:val="false"/>
+                                <w:szCs w:val="28"/>
+                                <w:iCs w:val="false"/>
+                                <w:color w:val="000000"/>
+                              </w:rPr>
                               <w:t>2</w:t>
                             </w:r>
                             <w:r>
-                              <w:rPr/>
+                              <w:rPr>
+                                <w:sz w:val="28"/>
+                                <w:i w:val="false"/>
+                                <w:szCs w:val="28"/>
+                                <w:iCs w:val="false"/>
+                                <w:color w:val="000000"/>
+                              </w:rPr>
                               <w:fldChar w:fldCharType="end"/>
                             </w:r>
                             <w:r>
-                              <w:rPr/>
+                              <w:rPr>
+                                <w:i w:val="false"/>
+                                <w:iCs w:val="false"/>
+                                <w:color w:val="000000"/>
+                                <w:sz w:val="28"/>
+                                <w:szCs w:val="28"/>
+                              </w:rPr>
                               <w:t>: Равномерное распределение внутри круга</w:t>
                             </w:r>
                           </w:p>
@@ -1436,24 +1595,36 @@
           </mc:Choice>
           <mc:Fallback>
             <w:pict>
-              <v:rect id="shape_0" fillcolor="white" stroked="f" o:allowincell="f" style="position:absolute;margin-left:83.15pt;margin-top:0.05pt;width:301.35pt;height:229.5pt;mso-wrap-style:square;v-text-anchor:top;mso-position-horizontal:center">
+              <v:rect id="shape_0" ID="Врезка5" path="m0,0l-2147483645,0l-2147483645,-2147483646l0,-2147483646xe" fillcolor="white" stroked="f" o:allowincell="f" style="position:absolute;margin-left:83.15pt;margin-top:0.05pt;width:301.35pt;height:229.5pt;mso-wrap-style:square;v-text-anchor:top;mso-position-horizontal:center">
                 <v:fill o:detectmouseclick="t" type="solid" color2="black"/>
                 <v:stroke color="#3465a4" joinstyle="round" endcap="flat"/>
                 <v:textbox>
                   <w:txbxContent>
                     <w:p>
                       <w:pPr>
-                        <w:pStyle w:val="user7"/>
+                        <w:pStyle w:val="Style21"/>
                         <w:spacing w:before="120" w:after="120"/>
-                        <w:rPr/>
+                        <w:rPr>
+                          <w:i w:val="false"/>
+                          <w:i w:val="false"/>
+                          <w:iCs w:val="false"/>
+                          <w:sz w:val="28"/>
+                          <w:szCs w:val="28"/>
+                        </w:rPr>
                       </w:pPr>
                       <w:r>
-                        <w:rPr/>
+                        <w:rPr>
+                          <w:i w:val="false"/>
+                          <w:iCs w:val="false"/>
+                          <w:color w:val="000000"/>
+                          <w:sz w:val="28"/>
+                          <w:szCs w:val="28"/>
+                        </w:rPr>
                         <w:drawing>
                           <wp:inline distT="0" distB="0" distL="0" distR="0">
                             <wp:extent cx="3827780" cy="2322195"/>
                             <wp:effectExtent l="0" t="0" r="0" b="0"/>
-                            <wp:docPr id="9" name="Picture 4"/>
+                            <wp:docPr id="8" name="Picture 4" descr=""/>
                             <wp:cNvGraphicFramePr>
                               <a:graphicFrameLocks xmlns:a="http://schemas.openxmlformats.org/drawingml/2006/main" noChangeAspect="1"/>
                             </wp:cNvGraphicFramePr>
@@ -1461,7 +1632,7 @@
                               <a:graphicData uri="http://schemas.openxmlformats.org/drawingml/2006/picture">
                                 <pic:pic xmlns:pic="http://schemas.openxmlformats.org/drawingml/2006/picture">
                                   <pic:nvPicPr>
-                                    <pic:cNvPr id="9" name="Picture 4"/>
+                                    <pic:cNvPr id="8" name="Picture 4" descr=""/>
                                     <pic:cNvPicPr>
                                       <a:picLocks noChangeAspect="1" noChangeArrowheads="1"/>
                                     </pic:cNvPicPr>
@@ -1480,7 +1651,6 @@
                                     <a:prstGeom prst="rect">
                                       <a:avLst/>
                                     </a:prstGeom>
-                                    <a:noFill/>
                                   </pic:spPr>
                                 </pic:pic>
                               </a:graphicData>
@@ -1489,31 +1659,73 @@
                         </w:drawing>
                       </w:r>
                       <w:r>
-                        <w:rPr/>
+                        <w:rPr>
+                          <w:i w:val="false"/>
+                          <w:iCs w:val="false"/>
+                          <w:color w:val="000000"/>
+                          <w:sz w:val="28"/>
+                          <w:szCs w:val="28"/>
+                        </w:rPr>
                         <w:t xml:space="preserve">Рисунок </w:t>
                       </w:r>
                       <w:r>
-                        <w:rPr/>
+                        <w:rPr>
+                          <w:i w:val="false"/>
+                          <w:iCs w:val="false"/>
+                          <w:color w:val="000000"/>
+                          <w:sz w:val="28"/>
+                          <w:szCs w:val="28"/>
+                        </w:rPr>
                         <w:fldChar w:fldCharType="begin"/>
                       </w:r>
                       <w:r>
-                        <w:rPr/>
+                        <w:rPr>
+                          <w:sz w:val="28"/>
+                          <w:i w:val="false"/>
+                          <w:szCs w:val="28"/>
+                          <w:iCs w:val="false"/>
+                          <w:color w:val="000000"/>
+                        </w:rPr>
                         <w:instrText xml:space="preserve"> SEQ Рисунок \* ARABIC </w:instrText>
                       </w:r>
                       <w:r>
-                        <w:rPr/>
+                        <w:rPr>
+                          <w:sz w:val="28"/>
+                          <w:i w:val="false"/>
+                          <w:szCs w:val="28"/>
+                          <w:iCs w:val="false"/>
+                          <w:color w:val="000000"/>
+                        </w:rPr>
                         <w:fldChar w:fldCharType="separate"/>
                       </w:r>
                       <w:r>
-                        <w:rPr/>
+                        <w:rPr>
+                          <w:sz w:val="28"/>
+                          <w:i w:val="false"/>
+                          <w:szCs w:val="28"/>
+                          <w:iCs w:val="false"/>
+                          <w:color w:val="000000"/>
+                        </w:rPr>
                         <w:t>2</w:t>
                       </w:r>
                       <w:r>
-                        <w:rPr/>
+                        <w:rPr>
+                          <w:sz w:val="28"/>
+                          <w:i w:val="false"/>
+                          <w:szCs w:val="28"/>
+                          <w:iCs w:val="false"/>
+                          <w:color w:val="000000"/>
+                        </w:rPr>
                         <w:fldChar w:fldCharType="end"/>
                       </w:r>
                       <w:r>
-                        <w:rPr/>
+                        <w:rPr>
+                          <w:i w:val="false"/>
+                          <w:iCs w:val="false"/>
+                          <w:color w:val="000000"/>
+                          <w:sz w:val="28"/>
+                          <w:szCs w:val="28"/>
+                        </w:rPr>
                         <w:t>: Равномерное распределение внутри круга</w:t>
                       </w:r>
                     </w:p>
@@ -1658,6 +1870,7 @@
           <w:ilvl w:val="0"/>
           <w:numId w:val="0"/>
         </w:numPr>
+        <w:spacing w:before="0" w:after="140"/>
         <w:ind w:hanging="0" w:left="720"/>
         <w:rPr>
           <w:rFonts w:ascii="Times New Roman" w:hAnsi="Times New Roman" w:cs="Times New Roman"/>
@@ -1666,15 +1879,13 @@
         </w:rPr>
       </w:pPr>
       <w:r>
-        <w:rPr>
-          <w:rFonts w:cs="Times New Roman"/>
-          <w:sz w:val="28"/>
-          <w:lang w:val="ru-RU"/>
-        </w:rPr>
+        <w:rPr/>
+      </w:r>
+      <w:r>
         <mc:AlternateContent>
           <mc:Choice Requires="wps">
             <w:drawing>
-              <wp:anchor distT="0" distB="0" distL="0" distR="0" simplePos="0" relativeHeight="13" behindDoc="0" locked="0" layoutInCell="0" allowOverlap="1">
+              <wp:anchor behindDoc="0" distT="0" distB="0" distL="0" distR="0" simplePos="0" locked="0" layoutInCell="0" allowOverlap="1" relativeHeight="32">
                 <wp:simplePos x="0" y="0"/>
                 <wp:positionH relativeFrom="column">
                   <wp:align>center</wp:align>
@@ -1682,50 +1893,50 @@
                 <wp:positionV relativeFrom="paragraph">
                   <wp:posOffset>635</wp:posOffset>
                 </wp:positionV>
-                <wp:extent cx="4200525" cy="3256280"/>
+                <wp:extent cx="4200525" cy="3476625"/>
                 <wp:effectExtent l="0" t="0" r="0" b="0"/>
                 <wp:wrapSquare wrapText="largest"/>
-                <wp:docPr id="10" name="Врезка6"/>
+                <wp:docPr id="6" name="Врезка6"/>
                 <a:graphic xmlns:a="http://schemas.openxmlformats.org/drawingml/2006/main">
                   <a:graphicData uri="http://schemas.microsoft.com/office/word/2010/wordprocessingShape">
                     <wps:wsp>
-                      <wps:cNvSpPr/>
+                      <wps:cNvSpPr txBox="1"/>
                       <wps:spPr>
                         <a:xfrm>
                           <a:off x="0" y="0"/>
-                          <a:ext cx="4200480" cy="3256200"/>
+                          <a:ext cx="4200525" cy="3476625"/>
                         </a:xfrm>
-                        <a:prstGeom prst="rect">
-                          <a:avLst/>
-                        </a:prstGeom>
+                        <a:prstGeom prst="rect"/>
                         <a:solidFill>
-                          <a:srgbClr val="ffffff"/>
+                          <a:srgbClr val="FFFFFF"/>
                         </a:solidFill>
-                        <a:ln w="0">
-                          <a:noFill/>
-                        </a:ln>
                       </wps:spPr>
-                      <wps:style>
-                        <a:lnRef idx="0"/>
-                        <a:fillRef idx="0"/>
-                        <a:effectRef idx="0"/>
-                        <a:fontRef idx="minor"/>
-                      </wps:style>
                       <wps:txbx>
                         <w:txbxContent>
                           <w:p>
                             <w:pPr>
-                              <w:pStyle w:val="user7"/>
+                              <w:pStyle w:val="Style21"/>
                               <w:spacing w:before="120" w:after="120"/>
-                              <w:rPr/>
+                              <w:rPr>
+                                <w:i w:val="false"/>
+                                <w:i w:val="false"/>
+                                <w:iCs w:val="false"/>
+                                <w:sz w:val="28"/>
+                                <w:szCs w:val="28"/>
+                              </w:rPr>
                             </w:pPr>
                             <w:r>
-                              <w:rPr/>
+                              <w:rPr>
+                                <w:i w:val="false"/>
+                                <w:iCs w:val="false"/>
+                                <w:sz w:val="28"/>
+                                <w:szCs w:val="28"/>
+                              </w:rPr>
                               <w:drawing>
                                 <wp:inline distT="0" distB="0" distL="0" distR="0">
                                   <wp:extent cx="4200525" cy="2883535"/>
                                   <wp:effectExtent l="0" t="0" r="0" b="0"/>
-                                  <wp:docPr id="11" name="Picture 5"/>
+                                  <wp:docPr id="7" name="Picture 5" descr=""/>
                                   <wp:cNvGraphicFramePr>
                                     <a:graphicFrameLocks xmlns:a="http://schemas.openxmlformats.org/drawingml/2006/main" noChangeAspect="1"/>
                                   </wp:cNvGraphicFramePr>
@@ -1733,7 +1944,7 @@
                                     <a:graphicData uri="http://schemas.openxmlformats.org/drawingml/2006/picture">
                                       <pic:pic xmlns:pic="http://schemas.openxmlformats.org/drawingml/2006/picture">
                                         <pic:nvPicPr>
-                                          <pic:cNvPr id="11" name="Picture 5"/>
+                                          <pic:cNvPr id="7" name="Picture 5" descr=""/>
                                           <pic:cNvPicPr>
                                             <a:picLocks noChangeAspect="1" noChangeArrowheads="1"/>
                                           </pic:cNvPicPr>
@@ -1752,46 +1963,72 @@
                                           <a:prstGeom prst="rect">
                                             <a:avLst/>
                                           </a:prstGeom>
-                                          <a:noFill/>
                                         </pic:spPr>
                                       </pic:pic>
                                     </a:graphicData>
                                   </a:graphic>
                                 </wp:inline>
                               </w:drawing>
-                            </w:r>
-                            <w:r>
-                              <w:rPr/>
                               <w:t xml:space="preserve">Рисунок </w:t>
                             </w:r>
                             <w:r>
-                              <w:rPr/>
+                              <w:rPr>
+                                <w:i w:val="false"/>
+                                <w:iCs w:val="false"/>
+                                <w:sz w:val="28"/>
+                                <w:szCs w:val="28"/>
+                              </w:rPr>
                               <w:fldChar w:fldCharType="begin"/>
                             </w:r>
                             <w:r>
-                              <w:rPr/>
+                              <w:rPr>
+                                <w:sz w:val="28"/>
+                                <w:i w:val="false"/>
+                                <w:szCs w:val="28"/>
+                                <w:iCs w:val="false"/>
+                              </w:rPr>
                               <w:instrText xml:space="preserve"> SEQ Рисунок \* ARABIC </w:instrText>
                             </w:r>
                             <w:r>
-                              <w:rPr/>
+                              <w:rPr>
+                                <w:sz w:val="28"/>
+                                <w:i w:val="false"/>
+                                <w:szCs w:val="28"/>
+                                <w:iCs w:val="false"/>
+                              </w:rPr>
                               <w:fldChar w:fldCharType="separate"/>
                             </w:r>
                             <w:r>
-                              <w:rPr/>
+                              <w:rPr>
+                                <w:sz w:val="28"/>
+                                <w:i w:val="false"/>
+                                <w:szCs w:val="28"/>
+                                <w:iCs w:val="false"/>
+                              </w:rPr>
                               <w:t>3</w:t>
                             </w:r>
                             <w:r>
-                              <w:rPr/>
+                              <w:rPr>
+                                <w:sz w:val="28"/>
+                                <w:i w:val="false"/>
+                                <w:szCs w:val="28"/>
+                                <w:iCs w:val="false"/>
+                              </w:rPr>
                               <w:fldChar w:fldCharType="end"/>
                             </w:r>
                             <w:r>
-                              <w:rPr/>
-                              <w:t>: Распределение в пространстве</w:t>
+                              <w:rPr>
+                                <w:i w:val="false"/>
+                                <w:iCs w:val="false"/>
+                                <w:sz w:val="28"/>
+                                <w:szCs w:val="28"/>
+                              </w:rPr>
+                              <w:t>: Равномерное распределение точек на поверхности сферы</w:t>
                             </w:r>
                           </w:p>
                         </w:txbxContent>
                       </wps:txbx>
-                      <wps:bodyPr lIns="0" rIns="0" tIns="0" bIns="0" anchor="t">
+                      <wps:bodyPr anchor="t" lIns="0" tIns="0" rIns="0" bIns="0">
                         <a:noAutofit/>
                       </wps:bodyPr>
                     </wps:wsp>
@@ -1802,24 +2039,33 @@
           </mc:Choice>
           <mc:Fallback>
             <w:pict>
-              <v:rect id="shape_0" fillcolor="white" stroked="f" o:allowincell="f" style="position:absolute;margin-left:68.45pt;margin-top:0.05pt;width:330.7pt;height:256.35pt;mso-wrap-style:square;v-text-anchor:top;mso-position-horizontal:center">
-                <v:fill o:detectmouseclick="t" type="solid" color2="black"/>
-                <v:stroke color="#3465a4" joinstyle="round" endcap="flat"/>
-                <v:textbox>
+              <v:rect style="position:absolute;rotation:-0;width:330.75pt;height:273.75pt;mso-wrap-distance-left:0pt;mso-wrap-distance-right:0pt;mso-wrap-distance-top:0pt;mso-wrap-distance-bottom:0pt;margin-top:0pt;mso-position-vertical:top;mso-position-vertical-relative:text;margin-left:68.5pt;mso-position-horizontal:center;mso-position-horizontal-relative:text">
+                <v:textbox inset="0in,0in,0in,0in">
                   <w:txbxContent>
                     <w:p>
                       <w:pPr>
-                        <w:pStyle w:val="user7"/>
+                        <w:pStyle w:val="Style21"/>
                         <w:spacing w:before="120" w:after="120"/>
-                        <w:rPr/>
+                        <w:rPr>
+                          <w:i w:val="false"/>
+                          <w:i w:val="false"/>
+                          <w:iCs w:val="false"/>
+                          <w:sz w:val="28"/>
+                          <w:szCs w:val="28"/>
+                        </w:rPr>
                       </w:pPr>
                       <w:r>
-                        <w:rPr/>
+                        <w:rPr>
+                          <w:i w:val="false"/>
+                          <w:iCs w:val="false"/>
+                          <w:sz w:val="28"/>
+                          <w:szCs w:val="28"/>
+                        </w:rPr>
                         <w:drawing>
                           <wp:inline distT="0" distB="0" distL="0" distR="0">
                             <wp:extent cx="4200525" cy="2883535"/>
                             <wp:effectExtent l="0" t="0" r="0" b="0"/>
-                            <wp:docPr id="12" name="Picture 5"/>
+                            <wp:docPr id="8" name="Picture 5" descr=""/>
                             <wp:cNvGraphicFramePr>
                               <a:graphicFrameLocks xmlns:a="http://schemas.openxmlformats.org/drawingml/2006/main" noChangeAspect="1"/>
                             </wp:cNvGraphicFramePr>
@@ -1827,7 +2073,7 @@
                               <a:graphicData uri="http://schemas.openxmlformats.org/drawingml/2006/picture">
                                 <pic:pic xmlns:pic="http://schemas.openxmlformats.org/drawingml/2006/picture">
                                   <pic:nvPicPr>
-                                    <pic:cNvPr id="12" name="Picture 5"/>
+                                    <pic:cNvPr id="8" name="Picture 5" descr=""/>
                                     <pic:cNvPicPr>
                                       <a:picLocks noChangeAspect="1" noChangeArrowheads="1"/>
                                     </pic:cNvPicPr>
@@ -1846,41 +2092,67 @@
                                     <a:prstGeom prst="rect">
                                       <a:avLst/>
                                     </a:prstGeom>
-                                    <a:noFill/>
                                   </pic:spPr>
                                 </pic:pic>
                               </a:graphicData>
                             </a:graphic>
                           </wp:inline>
                         </w:drawing>
-                      </w:r>
-                      <w:r>
-                        <w:rPr/>
                         <w:t xml:space="preserve">Рисунок </w:t>
                       </w:r>
                       <w:r>
-                        <w:rPr/>
+                        <w:rPr>
+                          <w:i w:val="false"/>
+                          <w:iCs w:val="false"/>
+                          <w:sz w:val="28"/>
+                          <w:szCs w:val="28"/>
+                        </w:rPr>
                         <w:fldChar w:fldCharType="begin"/>
                       </w:r>
                       <w:r>
-                        <w:rPr/>
+                        <w:rPr>
+                          <w:sz w:val="28"/>
+                          <w:i w:val="false"/>
+                          <w:szCs w:val="28"/>
+                          <w:iCs w:val="false"/>
+                        </w:rPr>
                         <w:instrText xml:space="preserve"> SEQ Рисунок \* ARABIC </w:instrText>
                       </w:r>
                       <w:r>
-                        <w:rPr/>
+                        <w:rPr>
+                          <w:sz w:val="28"/>
+                          <w:i w:val="false"/>
+                          <w:szCs w:val="28"/>
+                          <w:iCs w:val="false"/>
+                        </w:rPr>
                         <w:fldChar w:fldCharType="separate"/>
                       </w:r>
                       <w:r>
-                        <w:rPr/>
+                        <w:rPr>
+                          <w:sz w:val="28"/>
+                          <w:i w:val="false"/>
+                          <w:szCs w:val="28"/>
+                          <w:iCs w:val="false"/>
+                        </w:rPr>
                         <w:t>3</w:t>
                       </w:r>
                       <w:r>
-                        <w:rPr/>
+                        <w:rPr>
+                          <w:sz w:val="28"/>
+                          <w:i w:val="false"/>
+                          <w:szCs w:val="28"/>
+                          <w:iCs w:val="false"/>
+                        </w:rPr>
                         <w:fldChar w:fldCharType="end"/>
                       </w:r>
                       <w:r>
-                        <w:rPr/>
-                        <w:t>: Распределение в пространстве</w:t>
+                        <w:rPr>
+                          <w:i w:val="false"/>
+                          <w:iCs w:val="false"/>
+                          <w:sz w:val="28"/>
+                          <w:szCs w:val="28"/>
+                        </w:rPr>
+                        <w:t>: Равномерное распределение точек на поверхности сферы</w:t>
                       </w:r>
                     </w:p>
                   </w:txbxContent>
@@ -1890,6 +2162,28 @@
             </w:pict>
           </mc:Fallback>
         </mc:AlternateContent>
+      </w:r>
+    </w:p>
+    <w:p>
+      <w:pPr>
+        <w:pStyle w:val="BodyText"/>
+        <w:numPr>
+          <w:ilvl w:val="0"/>
+          <w:numId w:val="0"/>
+        </w:numPr>
+        <w:ind w:hanging="0" w:left="720"/>
+        <w:rPr>
+          <w:rFonts w:ascii="Times New Roman" w:hAnsi="Times New Roman" w:cs="Times New Roman"/>
+          <w:sz w:val="28"/>
+          <w:lang w:val="ru-RU"/>
+        </w:rPr>
+      </w:pPr>
+      <w:r>
+        <w:rPr>
+          <w:rFonts w:cs="Times New Roman"/>
+          <w:sz w:val="28"/>
+          <w:lang w:val="ru-RU"/>
+        </w:rPr>
       </w:r>
     </w:p>
     <w:p>
@@ -2143,7 +2437,7 @@
         <mc:AlternateContent>
           <mc:Choice Requires="wps">
             <w:drawing>
-              <wp:anchor distT="0" distB="0" distL="0" distR="0" simplePos="0" relativeHeight="15" behindDoc="0" locked="0" layoutInCell="0" allowOverlap="1">
+              <wp:anchor behindDoc="0" distT="0" distB="0" distL="0" distR="0" simplePos="0" locked="0" layoutInCell="0" allowOverlap="1" relativeHeight="13">
                 <wp:simplePos x="0" y="0"/>
                 <wp:positionH relativeFrom="column">
                   <wp:align>center</wp:align>
@@ -2154,7 +2448,7 @@
                 <wp:extent cx="4109085" cy="3385185"/>
                 <wp:effectExtent l="0" t="0" r="0" b="0"/>
                 <wp:wrapSquare wrapText="largest"/>
-                <wp:docPr id="13" name="Врезка8"/>
+                <wp:docPr id="9" name="Врезка8"/>
                 <a:graphic xmlns:a="http://schemas.openxmlformats.org/drawingml/2006/main">
                   <a:graphicData uri="http://schemas.microsoft.com/office/word/2010/wordprocessingShape">
                     <wps:wsp>
@@ -2184,17 +2478,29 @@
                         <w:txbxContent>
                           <w:p>
                             <w:pPr>
-                              <w:pStyle w:val="user7"/>
+                              <w:pStyle w:val="Style21"/>
                               <w:spacing w:before="120" w:after="120"/>
-                              <w:rPr/>
+                              <w:rPr>
+                                <w:i w:val="false"/>
+                                <w:i w:val="false"/>
+                                <w:iCs w:val="false"/>
+                                <w:sz w:val="28"/>
+                                <w:szCs w:val="28"/>
+                              </w:rPr>
                             </w:pPr>
                             <w:r>
-                              <w:rPr/>
+                              <w:rPr>
+                                <w:i w:val="false"/>
+                                <w:iCs w:val="false"/>
+                                <w:color w:val="000000"/>
+                                <w:sz w:val="28"/>
+                                <w:szCs w:val="28"/>
+                              </w:rPr>
                               <w:drawing>
                                 <wp:inline distT="0" distB="0" distL="0" distR="0">
                                   <wp:extent cx="4109085" cy="3012440"/>
                                   <wp:effectExtent l="0" t="0" r="0" b="0"/>
-                                  <wp:docPr id="14" name="Picture 6"/>
+                                  <wp:docPr id="11" name="Picture 6" descr=""/>
                                   <wp:cNvGraphicFramePr>
                                     <a:graphicFrameLocks xmlns:a="http://schemas.openxmlformats.org/drawingml/2006/main" noChangeAspect="1"/>
                                   </wp:cNvGraphicFramePr>
@@ -2202,7 +2508,7 @@
                                     <a:graphicData uri="http://schemas.openxmlformats.org/drawingml/2006/picture">
                                       <pic:pic xmlns:pic="http://schemas.openxmlformats.org/drawingml/2006/picture">
                                         <pic:nvPicPr>
-                                          <pic:cNvPr id="14" name="Picture 6"/>
+                                          <pic:cNvPr id="11" name="Picture 6" descr=""/>
                                           <pic:cNvPicPr>
                                             <a:picLocks noChangeAspect="1" noChangeArrowheads="1"/>
                                           </pic:cNvPicPr>
@@ -2221,7 +2527,6 @@
                                           <a:prstGeom prst="rect">
                                             <a:avLst/>
                                           </a:prstGeom>
-                                          <a:noFill/>
                                         </pic:spPr>
                                       </pic:pic>
                                     </a:graphicData>
@@ -2230,32 +2535,84 @@
                               </w:drawing>
                             </w:r>
                             <w:r>
-                              <w:rPr/>
+                              <w:rPr>
+                                <w:i w:val="false"/>
+                                <w:iCs w:val="false"/>
+                                <w:color w:val="000000"/>
+                                <w:sz w:val="28"/>
+                                <w:szCs w:val="28"/>
+                              </w:rPr>
                               <w:t xml:space="preserve">Рисунок </w:t>
                             </w:r>
                             <w:r>
-                              <w:rPr/>
+                              <w:rPr>
+                                <w:i w:val="false"/>
+                                <w:iCs w:val="false"/>
+                                <w:color w:val="000000"/>
+                                <w:sz w:val="28"/>
+                                <w:szCs w:val="28"/>
+                              </w:rPr>
                               <w:fldChar w:fldCharType="begin"/>
                             </w:r>
                             <w:r>
-                              <w:rPr/>
+                              <w:rPr>
+                                <w:sz w:val="28"/>
+                                <w:i w:val="false"/>
+                                <w:szCs w:val="28"/>
+                                <w:iCs w:val="false"/>
+                                <w:color w:val="000000"/>
+                              </w:rPr>
                               <w:instrText xml:space="preserve"> SEQ Рисунок \* ARABIC </w:instrText>
                             </w:r>
                             <w:r>
-                              <w:rPr/>
+                              <w:rPr>
+                                <w:sz w:val="28"/>
+                                <w:i w:val="false"/>
+                                <w:szCs w:val="28"/>
+                                <w:iCs w:val="false"/>
+                                <w:color w:val="000000"/>
+                              </w:rPr>
                               <w:fldChar w:fldCharType="separate"/>
                             </w:r>
                             <w:r>
-                              <w:rPr/>
+                              <w:rPr>
+                                <w:sz w:val="28"/>
+                                <w:i w:val="false"/>
+                                <w:szCs w:val="28"/>
+                                <w:iCs w:val="false"/>
+                                <w:color w:val="000000"/>
+                              </w:rPr>
                               <w:t>4</w:t>
                             </w:r>
                             <w:r>
-                              <w:rPr/>
+                              <w:rPr>
+                                <w:sz w:val="28"/>
+                                <w:i w:val="false"/>
+                                <w:szCs w:val="28"/>
+                                <w:iCs w:val="false"/>
+                                <w:color w:val="000000"/>
+                              </w:rPr>
                               <w:fldChar w:fldCharType="end"/>
                             </w:r>
                             <w:r>
-                              <w:rPr/>
-                              <w:t>: Косинусное распределение</w:t>
+                              <w:rPr>
+                                <w:i w:val="false"/>
+                                <w:iCs w:val="false"/>
+                                <w:color w:val="000000"/>
+                                <w:sz w:val="28"/>
+                                <w:szCs w:val="28"/>
+                              </w:rPr>
+                              <w:t xml:space="preserve">: Косинусное распределение </w:t>
+                            </w:r>
+                            <w:r>
+                              <w:rPr>
+                                <w:i w:val="false"/>
+                                <w:iCs w:val="false"/>
+                                <w:color w:val="000000"/>
+                                <w:sz w:val="28"/>
+                                <w:szCs w:val="28"/>
+                              </w:rPr>
+                              <w:t>направлений</w:t>
                             </w:r>
                           </w:p>
                         </w:txbxContent>
@@ -2271,24 +2628,36 @@
           </mc:Choice>
           <mc:Fallback>
             <w:pict>
-              <v:rect id="shape_0" fillcolor="white" stroked="f" o:allowincell="f" style="position:absolute;margin-left:72.05pt;margin-top:0.05pt;width:323.5pt;height:266.5pt;mso-wrap-style:square;v-text-anchor:top;mso-position-horizontal:center">
+              <v:rect id="shape_0" ID="Врезка8" path="m0,0l-2147483645,0l-2147483645,-2147483646l0,-2147483646xe" fillcolor="white" stroked="f" o:allowincell="f" style="position:absolute;margin-left:72.05pt;margin-top:0.05pt;width:323.5pt;height:266.5pt;mso-wrap-style:square;v-text-anchor:top;mso-position-horizontal:center">
                 <v:fill o:detectmouseclick="t" type="solid" color2="black"/>
                 <v:stroke color="#3465a4" joinstyle="round" endcap="flat"/>
                 <v:textbox>
                   <w:txbxContent>
                     <w:p>
                       <w:pPr>
-                        <w:pStyle w:val="user7"/>
+                        <w:pStyle w:val="Style21"/>
                         <w:spacing w:before="120" w:after="120"/>
-                        <w:rPr/>
+                        <w:rPr>
+                          <w:i w:val="false"/>
+                          <w:i w:val="false"/>
+                          <w:iCs w:val="false"/>
+                          <w:sz w:val="28"/>
+                          <w:szCs w:val="28"/>
+                        </w:rPr>
                       </w:pPr>
                       <w:r>
-                        <w:rPr/>
+                        <w:rPr>
+                          <w:i w:val="false"/>
+                          <w:iCs w:val="false"/>
+                          <w:color w:val="000000"/>
+                          <w:sz w:val="28"/>
+                          <w:szCs w:val="28"/>
+                        </w:rPr>
                         <w:drawing>
                           <wp:inline distT="0" distB="0" distL="0" distR="0">
                             <wp:extent cx="4109085" cy="3012440"/>
                             <wp:effectExtent l="0" t="0" r="0" b="0"/>
-                            <wp:docPr id="15" name="Picture 6"/>
+                            <wp:docPr id="12" name="Picture 6" descr=""/>
                             <wp:cNvGraphicFramePr>
                               <a:graphicFrameLocks xmlns:a="http://schemas.openxmlformats.org/drawingml/2006/main" noChangeAspect="1"/>
                             </wp:cNvGraphicFramePr>
@@ -2296,7 +2665,7 @@
                               <a:graphicData uri="http://schemas.openxmlformats.org/drawingml/2006/picture">
                                 <pic:pic xmlns:pic="http://schemas.openxmlformats.org/drawingml/2006/picture">
                                   <pic:nvPicPr>
-                                    <pic:cNvPr id="15" name="Picture 6"/>
+                                    <pic:cNvPr id="12" name="Picture 6" descr=""/>
                                     <pic:cNvPicPr>
                                       <a:picLocks noChangeAspect="1" noChangeArrowheads="1"/>
                                     </pic:cNvPicPr>
@@ -2315,7 +2684,6 @@
                                     <a:prstGeom prst="rect">
                                       <a:avLst/>
                                     </a:prstGeom>
-                                    <a:noFill/>
                                   </pic:spPr>
                                 </pic:pic>
                               </a:graphicData>
@@ -2324,32 +2692,84 @@
                         </w:drawing>
                       </w:r>
                       <w:r>
-                        <w:rPr/>
+                        <w:rPr>
+                          <w:i w:val="false"/>
+                          <w:iCs w:val="false"/>
+                          <w:color w:val="000000"/>
+                          <w:sz w:val="28"/>
+                          <w:szCs w:val="28"/>
+                        </w:rPr>
                         <w:t xml:space="preserve">Рисунок </w:t>
                       </w:r>
                       <w:r>
-                        <w:rPr/>
+                        <w:rPr>
+                          <w:i w:val="false"/>
+                          <w:iCs w:val="false"/>
+                          <w:color w:val="000000"/>
+                          <w:sz w:val="28"/>
+                          <w:szCs w:val="28"/>
+                        </w:rPr>
                         <w:fldChar w:fldCharType="begin"/>
                       </w:r>
                       <w:r>
-                        <w:rPr/>
+                        <w:rPr>
+                          <w:sz w:val="28"/>
+                          <w:i w:val="false"/>
+                          <w:szCs w:val="28"/>
+                          <w:iCs w:val="false"/>
+                          <w:color w:val="000000"/>
+                        </w:rPr>
                         <w:instrText xml:space="preserve"> SEQ Рисунок \* ARABIC </w:instrText>
                       </w:r>
                       <w:r>
-                        <w:rPr/>
+                        <w:rPr>
+                          <w:sz w:val="28"/>
+                          <w:i w:val="false"/>
+                          <w:szCs w:val="28"/>
+                          <w:iCs w:val="false"/>
+                          <w:color w:val="000000"/>
+                        </w:rPr>
                         <w:fldChar w:fldCharType="separate"/>
                       </w:r>
                       <w:r>
-                        <w:rPr/>
+                        <w:rPr>
+                          <w:sz w:val="28"/>
+                          <w:i w:val="false"/>
+                          <w:szCs w:val="28"/>
+                          <w:iCs w:val="false"/>
+                          <w:color w:val="000000"/>
+                        </w:rPr>
                         <w:t>4</w:t>
                       </w:r>
                       <w:r>
-                        <w:rPr/>
+                        <w:rPr>
+                          <w:sz w:val="28"/>
+                          <w:i w:val="false"/>
+                          <w:szCs w:val="28"/>
+                          <w:iCs w:val="false"/>
+                          <w:color w:val="000000"/>
+                        </w:rPr>
                         <w:fldChar w:fldCharType="end"/>
                       </w:r>
                       <w:r>
-                        <w:rPr/>
-                        <w:t>: Косинусное распределение</w:t>
+                        <w:rPr>
+                          <w:i w:val="false"/>
+                          <w:iCs w:val="false"/>
+                          <w:color w:val="000000"/>
+                          <w:sz w:val="28"/>
+                          <w:szCs w:val="28"/>
+                        </w:rPr>
+                        <w:t xml:space="preserve">: Косинусное распределение </w:t>
+                      </w:r>
+                      <w:r>
+                        <w:rPr>
+                          <w:i w:val="false"/>
+                          <w:iCs w:val="false"/>
+                          <w:color w:val="000000"/>
+                          <w:sz w:val="28"/>
+                          <w:szCs w:val="28"/>
+                        </w:rPr>
+                        <w:t>направлений</w:t>
                       </w:r>
                     </w:p>
                   </w:txbxContent>
@@ -2451,12 +2871,16 @@
           <w:bCs/>
           <w:color w:val="auto"/>
         </w:rPr>
-        <w:t>Пример входных данных и результаты</w:t>
+        <w:t>Доказательства корректности распределений</w:t>
       </w:r>
     </w:p>
     <w:p>
       <w:pPr>
         <w:pStyle w:val="BodyText"/>
+        <w:numPr>
+          <w:ilvl w:val="0"/>
+          <w:numId w:val="4"/>
+        </w:numPr>
         <w:spacing w:before="0" w:after="159"/>
         <w:rPr/>
       </w:pPr>
@@ -2464,7 +2888,552 @@
       <w:bookmarkEnd w:id="6"/>
       <w:r>
         <w:rPr/>
-        <w:t>Текст.</w:t>
+        <w:t>Для треугольника точки генерируются через барицентрические координаты с отражением по диагонали, что гарантирует одинаковую вероятность попадания точки в любую равную область треугольника - якобиан преобразования постоянен, поэтому распределение равномерное.</w:t>
+      </w:r>
+    </w:p>
+    <w:p>
+      <w:pPr>
+        <w:pStyle w:val="BodyText"/>
+        <w:numPr>
+          <w:ilvl w:val="0"/>
+          <w:numId w:val="4"/>
+        </w:numPr>
+        <w:spacing w:before="0" w:after="159"/>
+        <w:rPr/>
+      </w:pPr>
+      <w:r>
+        <w:rPr/>
+        <w:t xml:space="preserve">Для круга радиус берётся как </w:t>
+      </w:r>
+      <w:r>
+        <w:rPr/>
+      </w:r>
+      <m:oMath xmlns:m="http://schemas.openxmlformats.org/officeDocument/2006/math">
+        <m:r>
+          <w:rPr>
+            <w:rFonts w:ascii="Cambria Math" w:hAnsi="Cambria Math"/>
+          </w:rPr>
+          <m:t xml:space="preserve">r</m:t>
+        </m:r>
+        <m:r>
+          <w:rPr>
+            <w:rFonts w:ascii="Cambria Math" w:hAnsi="Cambria Math"/>
+          </w:rPr>
+          <m:t xml:space="preserve">=</m:t>
+        </m:r>
+        <m:r>
+          <w:rPr>
+            <w:rFonts w:ascii="Cambria Math" w:hAnsi="Cambria Math"/>
+          </w:rPr>
+          <m:t xml:space="preserve">R</m:t>
+        </m:r>
+        <m:rad>
+          <m:radPr>
+            <m:degHide m:val="1"/>
+          </m:radPr>
+          <m:deg/>
+          <m:e>
+            <m:sSub>
+              <m:e>
+                <m:r>
+                  <w:rPr>
+                    <w:rFonts w:ascii="Cambria Math" w:hAnsi="Cambria Math"/>
+                  </w:rPr>
+                  <m:t xml:space="preserve">ξ</m:t>
+                </m:r>
+              </m:e>
+              <m:sub>
+                <m:r>
+                  <w:rPr>
+                    <w:rFonts w:ascii="Cambria Math" w:hAnsi="Cambria Math"/>
+                  </w:rPr>
+                  <m:t xml:space="preserve">r</m:t>
+                </m:r>
+              </m:sub>
+            </m:sSub>
+          </m:e>
+        </m:rad>
+      </m:oMath>
+      <w:r>
+        <w:rPr/>
+        <w:t xml:space="preserve">, угол </w:t>
+      </w:r>
+      <w:r>
+        <w:rPr/>
+      </w:r>
+      <m:oMath xmlns:m="http://schemas.openxmlformats.org/officeDocument/2006/math">
+        <m:r>
+          <w:rPr>
+            <w:rFonts w:ascii="Cambria Math" w:hAnsi="Cambria Math"/>
+          </w:rPr>
+          <m:t xml:space="preserve">ϕ</m:t>
+        </m:r>
+      </m:oMath>
+      <w:r>
+        <w:rPr/>
+        <w:t xml:space="preserve"> равномерно в </w:t>
+      </w:r>
+      <w:r>
+        <w:rPr/>
+      </w:r>
+      <m:oMath xmlns:m="http://schemas.openxmlformats.org/officeDocument/2006/math">
+        <m:d>
+          <m:dPr>
+            <m:begChr m:val="["/>
+            <m:endChr m:val="]"/>
+          </m:dPr>
+          <m:e>
+            <m:r>
+              <w:rPr>
+                <w:rFonts w:ascii="Cambria Math" w:hAnsi="Cambria Math"/>
+              </w:rPr>
+              <m:t xml:space="preserve">0</m:t>
+            </m:r>
+            <m:r>
+              <w:rPr>
+                <w:rFonts w:ascii="Cambria Math" w:hAnsi="Cambria Math"/>
+              </w:rPr>
+              <m:t xml:space="preserve">,</m:t>
+            </m:r>
+            <m:r>
+              <w:rPr>
+                <w:rFonts w:ascii="Cambria Math" w:hAnsi="Cambria Math"/>
+              </w:rPr>
+              <m:t xml:space="preserve">2</m:t>
+            </m:r>
+            <m:r>
+              <w:rPr>
+                <w:rFonts w:ascii="Cambria Math" w:hAnsi="Cambria Math"/>
+              </w:rPr>
+              <m:t xml:space="preserve">π</m:t>
+            </m:r>
+          </m:e>
+        </m:d>
+      </m:oMath>
+      <w:r>
+        <w:rPr/>
+        <w:t xml:space="preserve">; использование корня из случайной величины обеспечивает, что элемент площади </w:t>
+      </w:r>
+      <w:r>
+        <w:rPr/>
+      </w:r>
+      <m:oMath xmlns:m="http://schemas.openxmlformats.org/officeDocument/2006/math">
+        <m:r>
+          <w:rPr>
+            <w:rFonts w:ascii="Cambria Math" w:hAnsi="Cambria Math"/>
+          </w:rPr>
+          <m:t xml:space="preserve">dS</m:t>
+        </m:r>
+        <m:r>
+          <w:rPr>
+            <w:rFonts w:ascii="Cambria Math" w:hAnsi="Cambria Math"/>
+          </w:rPr>
+          <m:t xml:space="preserve">=</m:t>
+        </m:r>
+        <m:r>
+          <w:rPr>
+            <w:rFonts w:ascii="Cambria Math" w:hAnsi="Cambria Math"/>
+          </w:rPr>
+          <m:t xml:space="preserve">r</m:t>
+        </m:r>
+        <m:r>
+          <w:rPr>
+            <w:rFonts w:ascii="Cambria Math" w:hAnsi="Cambria Math"/>
+          </w:rPr>
+          <m:t xml:space="preserve">dr</m:t>
+        </m:r>
+        <m:r>
+          <w:rPr>
+            <w:rFonts w:ascii="Cambria Math" w:hAnsi="Cambria Math"/>
+          </w:rPr>
+          <m:t xml:space="preserve">d</m:t>
+        </m:r>
+        <m:r>
+          <w:rPr>
+            <w:rFonts w:ascii="Cambria Math" w:hAnsi="Cambria Math"/>
+          </w:rPr>
+          <m:t xml:space="preserve">ϕ</m:t>
+        </m:r>
+      </m:oMath>
+      <w:r>
+        <w:rPr/>
+        <w:t xml:space="preserve"> распределён равномерно, и точки не скапливаются в центре.</w:t>
+      </w:r>
+    </w:p>
+    <w:p>
+      <w:pPr>
+        <w:pStyle w:val="BodyText"/>
+        <w:numPr>
+          <w:ilvl w:val="0"/>
+          <w:numId w:val="4"/>
+        </w:numPr>
+        <w:spacing w:before="0" w:after="159"/>
+        <w:rPr/>
+      </w:pPr>
+      <w:r>
+        <w:rPr/>
+        <w:t xml:space="preserve">Для сферы высота </w:t>
+      </w:r>
+      <w:r>
+        <w:rPr/>
+      </w:r>
+      <m:oMath xmlns:m="http://schemas.openxmlformats.org/officeDocument/2006/math">
+        <m:r>
+          <w:rPr>
+            <w:rFonts w:ascii="Cambria Math" w:hAnsi="Cambria Math"/>
+          </w:rPr>
+          <m:t xml:space="preserve">h</m:t>
+        </m:r>
+      </m:oMath>
+      <w:r>
+        <w:rPr/>
+        <w:t xml:space="preserve"> выбирается равномерно в </w:t>
+      </w:r>
+      <w:r>
+        <w:rPr/>
+      </w:r>
+      <m:oMath xmlns:m="http://schemas.openxmlformats.org/officeDocument/2006/math">
+        <m:d>
+          <m:dPr>
+            <m:begChr m:val="["/>
+            <m:endChr m:val="]"/>
+          </m:dPr>
+          <m:e>
+            <m:r>
+              <w:rPr>
+                <w:rFonts w:ascii="Cambria Math" w:hAnsi="Cambria Math"/>
+              </w:rPr>
+              <m:t xml:space="preserve">−</m:t>
+            </m:r>
+            <m:r>
+              <w:rPr>
+                <w:rFonts w:ascii="Cambria Math" w:hAnsi="Cambria Math"/>
+              </w:rPr>
+              <m:t xml:space="preserve">R</m:t>
+            </m:r>
+            <m:r>
+              <w:rPr>
+                <w:rFonts w:ascii="Cambria Math" w:hAnsi="Cambria Math"/>
+              </w:rPr>
+              <m:t xml:space="preserve">,</m:t>
+            </m:r>
+            <m:r>
+              <w:rPr>
+                <w:rFonts w:ascii="Cambria Math" w:hAnsi="Cambria Math"/>
+              </w:rPr>
+              <m:t xml:space="preserve">R</m:t>
+            </m:r>
+          </m:e>
+        </m:d>
+      </m:oMath>
+      <w:r>
+        <w:rPr/>
+        <w:t xml:space="preserve">, угол </w:t>
+      </w:r>
+      <w:r>
+        <w:rPr/>
+      </w:r>
+      <m:oMath xmlns:m="http://schemas.openxmlformats.org/officeDocument/2006/math">
+        <m:r>
+          <w:rPr>
+            <w:rFonts w:ascii="Cambria Math" w:hAnsi="Cambria Math"/>
+          </w:rPr>
+          <m:t xml:space="preserve">ϕ</m:t>
+        </m:r>
+      </m:oMath>
+      <w:r>
+        <w:rPr/>
+        <w:t xml:space="preserve"> равномерно в </w:t>
+      </w:r>
+      <w:r>
+        <w:rPr/>
+      </w:r>
+      <m:oMath xmlns:m="http://schemas.openxmlformats.org/officeDocument/2006/math">
+        <m:d>
+          <m:dPr>
+            <m:begChr m:val="["/>
+            <m:endChr m:val="]"/>
+          </m:dPr>
+          <m:e>
+            <m:r>
+              <w:rPr>
+                <w:rFonts w:ascii="Cambria Math" w:hAnsi="Cambria Math"/>
+              </w:rPr>
+              <m:t xml:space="preserve">0</m:t>
+            </m:r>
+            <m:r>
+              <w:rPr>
+                <w:rFonts w:ascii="Cambria Math" w:hAnsi="Cambria Math"/>
+              </w:rPr>
+              <m:t xml:space="preserve">,</m:t>
+            </m:r>
+            <m:r>
+              <w:rPr>
+                <w:rFonts w:ascii="Cambria Math" w:hAnsi="Cambria Math"/>
+              </w:rPr>
+              <m:t xml:space="preserve">2</m:t>
+            </m:r>
+            <m:r>
+              <w:rPr>
+                <w:rFonts w:ascii="Cambria Math" w:hAnsi="Cambria Math"/>
+              </w:rPr>
+              <m:t xml:space="preserve">π</m:t>
+            </m:r>
+          </m:e>
+        </m:d>
+      </m:oMath>
+      <w:r>
+        <w:rPr/>
+        <w:t xml:space="preserve">; это обеспечивает постоянную плотность точек на поверхности, так как элемент площади сферы </w:t>
+      </w:r>
+      <w:r>
+        <w:rPr/>
+      </w:r>
+      <m:oMath xmlns:m="http://schemas.openxmlformats.org/officeDocument/2006/math">
+        <m:r>
+          <w:rPr>
+            <w:rFonts w:ascii="Cambria Math" w:hAnsi="Cambria Math"/>
+          </w:rPr>
+          <m:t xml:space="preserve">dS</m:t>
+        </m:r>
+        <m:r>
+          <w:rPr>
+            <w:rFonts w:ascii="Cambria Math" w:hAnsi="Cambria Math"/>
+          </w:rPr>
+          <m:t xml:space="preserve">=</m:t>
+        </m:r>
+        <m:r>
+          <w:rPr>
+            <w:rFonts w:ascii="Cambria Math" w:hAnsi="Cambria Math"/>
+          </w:rPr>
+          <m:t xml:space="preserve">2</m:t>
+        </m:r>
+        <m:r>
+          <w:rPr>
+            <w:rFonts w:ascii="Cambria Math" w:hAnsi="Cambria Math"/>
+          </w:rPr>
+          <m:t xml:space="preserve">π</m:t>
+        </m:r>
+        <m:rad>
+          <m:radPr>
+            <m:degHide m:val="1"/>
+          </m:radPr>
+          <m:deg/>
+          <m:e>
+            <m:sSup>
+              <m:e>
+                <m:r>
+                  <w:rPr>
+                    <w:rFonts w:ascii="Cambria Math" w:hAnsi="Cambria Math"/>
+                  </w:rPr>
+                  <m:t xml:space="preserve">R</m:t>
+                </m:r>
+              </m:e>
+              <m:sup>
+                <m:r>
+                  <w:rPr>
+                    <w:rFonts w:ascii="Cambria Math" w:hAnsi="Cambria Math"/>
+                  </w:rPr>
+                  <m:t xml:space="preserve">2</m:t>
+                </m:r>
+              </m:sup>
+            </m:sSup>
+            <m:r>
+              <w:rPr>
+                <w:rFonts w:ascii="Cambria Math" w:hAnsi="Cambria Math"/>
+              </w:rPr>
+              <m:t xml:space="preserve">−</m:t>
+            </m:r>
+            <m:sSup>
+              <m:e>
+                <m:r>
+                  <w:rPr>
+                    <w:rFonts w:ascii="Cambria Math" w:hAnsi="Cambria Math"/>
+                  </w:rPr>
+                  <m:t xml:space="preserve">h</m:t>
+                </m:r>
+              </m:e>
+              <m:sup>
+                <m:r>
+                  <w:rPr>
+                    <w:rFonts w:ascii="Cambria Math" w:hAnsi="Cambria Math"/>
+                  </w:rPr>
+                  <m:t xml:space="preserve">2</m:t>
+                </m:r>
+              </m:sup>
+            </m:sSup>
+          </m:e>
+        </m:rad>
+        <m:r>
+          <w:rPr>
+            <w:rFonts w:ascii="Cambria Math" w:hAnsi="Cambria Math"/>
+          </w:rPr>
+          <m:t xml:space="preserve">dh</m:t>
+        </m:r>
+      </m:oMath>
+      <w:r>
+        <w:rPr/>
+        <w:t xml:space="preserve"> компенсируется равномерным выбором </w:t>
+      </w:r>
+      <w:r>
+        <w:rPr/>
+      </w:r>
+      <m:oMath xmlns:m="http://schemas.openxmlformats.org/officeDocument/2006/math">
+        <m:r>
+          <w:rPr>
+            <w:rFonts w:ascii="Cambria Math" w:hAnsi="Cambria Math"/>
+          </w:rPr>
+          <m:t xml:space="preserve">h</m:t>
+        </m:r>
+      </m:oMath>
+      <w:r>
+        <w:rPr/>
+        <w:t>.</w:t>
+      </w:r>
+    </w:p>
+    <w:p>
+      <w:pPr>
+        <w:pStyle w:val="BodyText"/>
+        <w:numPr>
+          <w:ilvl w:val="0"/>
+          <w:numId w:val="4"/>
+        </w:numPr>
+        <w:spacing w:before="0" w:after="159"/>
+        <w:rPr/>
+      </w:pPr>
+      <w:r>
+        <w:rPr/>
+        <w:t xml:space="preserve">Для косинусного распределения направлений используется стандартная схема </w:t>
+      </w:r>
+      <w:r>
+        <w:rPr/>
+        <w:t xml:space="preserve">с </w:t>
+      </w:r>
+      <w:r>
+        <w:rPr/>
+      </w:r>
+      <m:oMath xmlns:m="http://schemas.openxmlformats.org/officeDocument/2006/math">
+        <m:r>
+          <w:rPr>
+            <w:rFonts w:ascii="Cambria Math" w:hAnsi="Cambria Math"/>
+          </w:rPr>
+          <m:t xml:space="preserve">r</m:t>
+        </m:r>
+        <m:r>
+          <w:rPr>
+            <w:rFonts w:ascii="Cambria Math" w:hAnsi="Cambria Math"/>
+          </w:rPr>
+          <m:t xml:space="preserve">=</m:t>
+        </m:r>
+        <m:rad>
+          <m:radPr>
+            <m:degHide m:val="1"/>
+          </m:radPr>
+          <m:deg/>
+          <m:e>
+            <m:r>
+              <w:rPr>
+                <w:rFonts w:ascii="Cambria Math" w:hAnsi="Cambria Math"/>
+              </w:rPr>
+              <m:t xml:space="preserve">ξ</m:t>
+            </m:r>
+          </m:e>
+        </m:rad>
+      </m:oMath>
+      <w:r>
+        <w:rPr/>
+        <w:t xml:space="preserve">, </w:t>
+      </w:r>
+      <w:r>
+        <w:rPr/>
+      </w:r>
+      <m:oMath xmlns:m="http://schemas.openxmlformats.org/officeDocument/2006/math">
+        <m:r>
+          <w:rPr>
+            <w:rFonts w:ascii="Cambria Math" w:hAnsi="Cambria Math"/>
+          </w:rPr>
+          <m:t xml:space="preserve">z</m:t>
+        </m:r>
+        <m:r>
+          <w:rPr>
+            <w:rFonts w:ascii="Cambria Math" w:hAnsi="Cambria Math"/>
+          </w:rPr>
+          <m:t xml:space="preserve">=</m:t>
+        </m:r>
+        <m:rad>
+          <m:radPr>
+            <m:degHide m:val="1"/>
+          </m:radPr>
+          <m:deg/>
+          <m:e>
+            <m:r>
+              <w:rPr>
+                <w:rFonts w:ascii="Cambria Math" w:hAnsi="Cambria Math"/>
+              </w:rPr>
+              <m:t xml:space="preserve">1</m:t>
+            </m:r>
+            <m:r>
+              <w:rPr>
+                <w:rFonts w:ascii="Cambria Math" w:hAnsi="Cambria Math"/>
+              </w:rPr>
+              <m:t xml:space="preserve">−</m:t>
+            </m:r>
+            <m:r>
+              <w:rPr>
+                <w:rFonts w:ascii="Cambria Math" w:hAnsi="Cambria Math"/>
+              </w:rPr>
+              <m:t xml:space="preserve">ξ</m:t>
+            </m:r>
+          </m:e>
+        </m:rad>
+      </m:oMath>
+      <w:r>
+        <w:rPr/>
+        <w:t xml:space="preserve"> и равномерным </w:t>
+      </w:r>
+      <w:r>
+        <w:rPr/>
+      </w:r>
+      <m:oMath xmlns:m="http://schemas.openxmlformats.org/officeDocument/2006/math">
+        <m:r>
+          <w:rPr>
+            <w:rFonts w:ascii="Cambria Math" w:hAnsi="Cambria Math"/>
+          </w:rPr>
+          <m:t xml:space="preserve">ϕ</m:t>
+        </m:r>
+      </m:oMath>
+      <w:r>
+        <w:rPr/>
+        <w:t xml:space="preserve">; это даёт плотность направлений, пропорциональную </w:t>
+      </w:r>
+      <w:r>
+        <w:rPr/>
+      </w:r>
+      <m:oMath xmlns:m="http://schemas.openxmlformats.org/officeDocument/2006/math">
+        <m:r>
+          <w:rPr>
+            <w:rFonts w:ascii="Cambria Math" w:hAnsi="Cambria Math"/>
+          </w:rPr>
+          <m:t xml:space="preserve">cos</m:t>
+        </m:r>
+        <m:d>
+          <m:dPr>
+            <m:begChr m:val="("/>
+            <m:endChr m:val=")"/>
+          </m:dPr>
+          <m:e>
+            <m:r>
+              <w:rPr>
+                <w:rFonts w:ascii="Cambria Math" w:hAnsi="Cambria Math"/>
+              </w:rPr>
+              <m:t xml:space="preserve">ϕ</m:t>
+            </m:r>
+          </m:e>
+        </m:d>
+      </m:oMath>
+      <w:r>
+        <w:rPr/>
+        <w:t xml:space="preserve"> относительно нормали. При проекции этих направлений на сферу плотность точек на поверхности становится практически равномерной. </w:t>
       </w:r>
       <w:r>
         <w:br w:type="page"/>
@@ -2517,7 +3486,7 @@
           <w:rFonts w:eastAsia="Times New Roman" w:cs="Times New Roman"/>
           <w:szCs w:val="28"/>
         </w:rPr>
-        <w:t>В ходе работы.</w:t>
+        <w:t>В ходе работы я изучил, как правильно генерировать случайные точки внутри треугольника, круга и на сфере, а также направления с косинусной плотностью. Показано, что выбранные методы дают равномерное распределение точек и нужное распределение направлений, что подтверждает их корректность.</w:t>
       </w:r>
       <w:r>
         <w:br w:type="page"/>
@@ -2614,7 +3583,7 @@
 </file>
 
 <file path=word/footer1.xml><?xml version="1.0" encoding="utf-8"?>
-<w:ftr xmlns:o="urn:schemas-microsoft-com:office:office" xmlns:r="http://schemas.openxmlformats.org/officeDocument/2006/relationships" xmlns:v="urn:schemas-microsoft-com:vml" xmlns:w="http://schemas.openxmlformats.org/wordprocessingml/2006/main" xmlns:w10="urn:schemas-microsoft-com:office:word" xmlns:wp="http://schemas.openxmlformats.org/drawingml/2006/wordprocessingDrawing" xmlns:pic="http://schemas.openxmlformats.org/drawingml/2006/picture" xmlns:wps="http://schemas.microsoft.com/office/word/2010/wordprocessingShape" xmlns:wpg="http://schemas.microsoft.com/office/word/2010/wordprocessingGroup" xmlns:mc="http://schemas.openxmlformats.org/markup-compatibility/2006" xmlns:wp14="http://schemas.microsoft.com/office/word/2010/wordprocessingDrawing" xmlns:w14="http://schemas.microsoft.com/office/word/2010/wordml" xmlns:w15="http://schemas.microsoft.com/office/word/2012/wordml" mc:Ignorable="w14 wp14 w15">
+<w:ftr xmlns:o="urn:schemas-microsoft-com:office:office" xmlns:r="http://schemas.openxmlformats.org/officeDocument/2006/relationships" xmlns:v="urn:schemas-microsoft-com:vml" xmlns:w="http://schemas.openxmlformats.org/wordprocessingml/2006/main" xmlns:w10="urn:schemas-microsoft-com:office:word" xmlns:wp="http://schemas.openxmlformats.org/drawingml/2006/wordprocessingDrawing" xmlns:wps="http://schemas.microsoft.com/office/word/2010/wordprocessingShape" xmlns:wpg="http://schemas.microsoft.com/office/word/2010/wordprocessingGroup" xmlns:mc="http://schemas.openxmlformats.org/markup-compatibility/2006" xmlns:wp14="http://schemas.microsoft.com/office/word/2010/wordprocessingDrawing" xmlns:w14="http://schemas.microsoft.com/office/word/2010/wordml" xmlns:w15="http://schemas.microsoft.com/office/word/2012/wordml" mc:Ignorable="w14 wp14 w15">
   <w:p>
     <w:pPr>
       <w:pStyle w:val="Footer"/>
@@ -2628,7 +3597,7 @@
 </file>
 
 <file path=word/footer2.xml><?xml version="1.0" encoding="utf-8"?>
-<w:ftr xmlns:o="urn:schemas-microsoft-com:office:office" xmlns:r="http://schemas.openxmlformats.org/officeDocument/2006/relationships" xmlns:v="urn:schemas-microsoft-com:vml" xmlns:w="http://schemas.openxmlformats.org/wordprocessingml/2006/main" xmlns:w10="urn:schemas-microsoft-com:office:word" xmlns:wp="http://schemas.openxmlformats.org/drawingml/2006/wordprocessingDrawing" xmlns:pic="http://schemas.openxmlformats.org/drawingml/2006/picture" xmlns:wps="http://schemas.microsoft.com/office/word/2010/wordprocessingShape" xmlns:wpg="http://schemas.microsoft.com/office/word/2010/wordprocessingGroup" xmlns:mc="http://schemas.openxmlformats.org/markup-compatibility/2006" xmlns:wp14="http://schemas.microsoft.com/office/word/2010/wordprocessingDrawing" xmlns:w14="http://schemas.microsoft.com/office/word/2010/wordml" xmlns:w15="http://schemas.microsoft.com/office/word/2012/wordml" mc:Ignorable="w14 wp14 w15">
+<w:ftr xmlns:o="urn:schemas-microsoft-com:office:office" xmlns:r="http://schemas.openxmlformats.org/officeDocument/2006/relationships" xmlns:v="urn:schemas-microsoft-com:vml" xmlns:w="http://schemas.openxmlformats.org/wordprocessingml/2006/main" xmlns:w10="urn:schemas-microsoft-com:office:word" xmlns:wp="http://schemas.openxmlformats.org/drawingml/2006/wordprocessingDrawing" xmlns:wps="http://schemas.microsoft.com/office/word/2010/wordprocessingShape" xmlns:wpg="http://schemas.microsoft.com/office/word/2010/wordprocessingGroup" xmlns:mc="http://schemas.openxmlformats.org/markup-compatibility/2006" xmlns:wp14="http://schemas.microsoft.com/office/word/2010/wordprocessingDrawing" xmlns:w14="http://schemas.microsoft.com/office/word/2010/wordml" xmlns:w15="http://schemas.microsoft.com/office/word/2012/wordml" mc:Ignorable="w14 wp14 w15">
   <w:tbl>
     <w:tblPr>
       <w:tblW w:w="9345" w:type="dxa"/>
@@ -2743,7 +3712,7 @@
 </file>
 
 <file path=word/footer3.xml><?xml version="1.0" encoding="utf-8"?>
-<w:ftr xmlns:o="urn:schemas-microsoft-com:office:office" xmlns:r="http://schemas.openxmlformats.org/officeDocument/2006/relationships" xmlns:v="urn:schemas-microsoft-com:vml" xmlns:w="http://schemas.openxmlformats.org/wordprocessingml/2006/main" xmlns:w10="urn:schemas-microsoft-com:office:word" xmlns:wp="http://schemas.openxmlformats.org/drawingml/2006/wordprocessingDrawing" xmlns:pic="http://schemas.openxmlformats.org/drawingml/2006/picture" xmlns:wps="http://schemas.microsoft.com/office/word/2010/wordprocessingShape" xmlns:wpg="http://schemas.microsoft.com/office/word/2010/wordprocessingGroup" xmlns:mc="http://schemas.openxmlformats.org/markup-compatibility/2006" xmlns:wp14="http://schemas.microsoft.com/office/word/2010/wordprocessingDrawing" xmlns:w14="http://schemas.microsoft.com/office/word/2010/wordml" xmlns:w15="http://schemas.microsoft.com/office/word/2012/wordml" mc:Ignorable="w14 wp14 w15">
+<w:ftr xmlns:o="urn:schemas-microsoft-com:office:office" xmlns:r="http://schemas.openxmlformats.org/officeDocument/2006/relationships" xmlns:v="urn:schemas-microsoft-com:vml" xmlns:w="http://schemas.openxmlformats.org/wordprocessingml/2006/main" xmlns:w10="urn:schemas-microsoft-com:office:word" xmlns:wp="http://schemas.openxmlformats.org/drawingml/2006/wordprocessingDrawing" xmlns:wps="http://schemas.microsoft.com/office/word/2010/wordprocessingShape" xmlns:wpg="http://schemas.microsoft.com/office/word/2010/wordprocessingGroup" xmlns:mc="http://schemas.openxmlformats.org/markup-compatibility/2006" xmlns:wp14="http://schemas.microsoft.com/office/word/2010/wordprocessingDrawing" xmlns:w14="http://schemas.microsoft.com/office/word/2010/wordml" xmlns:w15="http://schemas.microsoft.com/office/word/2012/wordml" mc:Ignorable="w14 wp14 w15">
   <w:tbl>
     <w:tblPr>
       <w:tblW w:w="9345" w:type="dxa"/>
@@ -2840,7 +3809,7 @@
 </file>
 
 <file path=word/header1.xml><?xml version="1.0" encoding="utf-8"?>
-<w:hdr xmlns:o="urn:schemas-microsoft-com:office:office" xmlns:r="http://schemas.openxmlformats.org/officeDocument/2006/relationships" xmlns:v="urn:schemas-microsoft-com:vml" xmlns:w="http://schemas.openxmlformats.org/wordprocessingml/2006/main" xmlns:w10="urn:schemas-microsoft-com:office:word" xmlns:wp="http://schemas.openxmlformats.org/drawingml/2006/wordprocessingDrawing" xmlns:pic="http://schemas.openxmlformats.org/drawingml/2006/picture" xmlns:wps="http://schemas.microsoft.com/office/word/2010/wordprocessingShape" xmlns:wpg="http://schemas.microsoft.com/office/word/2010/wordprocessingGroup" xmlns:mc="http://schemas.openxmlformats.org/markup-compatibility/2006" xmlns:wp14="http://schemas.microsoft.com/office/word/2010/wordprocessingDrawing" xmlns:w14="http://schemas.microsoft.com/office/word/2010/wordml" xmlns:w15="http://schemas.microsoft.com/office/word/2012/wordml" mc:Ignorable="w14 wp14 w15">
+<w:hdr xmlns:o="urn:schemas-microsoft-com:office:office" xmlns:r="http://schemas.openxmlformats.org/officeDocument/2006/relationships" xmlns:v="urn:schemas-microsoft-com:vml" xmlns:w="http://schemas.openxmlformats.org/wordprocessingml/2006/main" xmlns:w10="urn:schemas-microsoft-com:office:word" xmlns:wp="http://schemas.openxmlformats.org/drawingml/2006/wordprocessingDrawing" xmlns:wps="http://schemas.microsoft.com/office/word/2010/wordprocessingShape" xmlns:wpg="http://schemas.microsoft.com/office/word/2010/wordprocessingGroup" xmlns:mc="http://schemas.openxmlformats.org/markup-compatibility/2006" xmlns:wp14="http://schemas.microsoft.com/office/word/2010/wordprocessingDrawing" xmlns:w14="http://schemas.microsoft.com/office/word/2010/wordml" xmlns:w15="http://schemas.microsoft.com/office/word/2012/wordml" mc:Ignorable="w14 wp14 w15">
   <w:p>
     <w:pPr>
       <w:pStyle w:val="Header"/>
@@ -2854,7 +3823,7 @@
 </file>
 
 <file path=word/header2.xml><?xml version="1.0" encoding="utf-8"?>
-<w:hdr xmlns:o="urn:schemas-microsoft-com:office:office" xmlns:r="http://schemas.openxmlformats.org/officeDocument/2006/relationships" xmlns:v="urn:schemas-microsoft-com:vml" xmlns:w="http://schemas.openxmlformats.org/wordprocessingml/2006/main" xmlns:w10="urn:schemas-microsoft-com:office:word" xmlns:wp="http://schemas.openxmlformats.org/drawingml/2006/wordprocessingDrawing" xmlns:pic="http://schemas.openxmlformats.org/drawingml/2006/picture" xmlns:wps="http://schemas.microsoft.com/office/word/2010/wordprocessingShape" xmlns:wpg="http://schemas.microsoft.com/office/word/2010/wordprocessingGroup" xmlns:mc="http://schemas.openxmlformats.org/markup-compatibility/2006" xmlns:wp14="http://schemas.microsoft.com/office/word/2010/wordprocessingDrawing" xmlns:w14="http://schemas.microsoft.com/office/word/2010/wordml" xmlns:w15="http://schemas.microsoft.com/office/word/2012/wordml" mc:Ignorable="w14 wp14 w15">
+<w:hdr xmlns:o="urn:schemas-microsoft-com:office:office" xmlns:r="http://schemas.openxmlformats.org/officeDocument/2006/relationships" xmlns:v="urn:schemas-microsoft-com:vml" xmlns:w="http://schemas.openxmlformats.org/wordprocessingml/2006/main" xmlns:w10="urn:schemas-microsoft-com:office:word" xmlns:wp="http://schemas.openxmlformats.org/drawingml/2006/wordprocessingDrawing" xmlns:wps="http://schemas.microsoft.com/office/word/2010/wordprocessingShape" xmlns:wpg="http://schemas.microsoft.com/office/word/2010/wordprocessingGroup" xmlns:mc="http://schemas.openxmlformats.org/markup-compatibility/2006" xmlns:wp14="http://schemas.microsoft.com/office/word/2010/wordprocessingDrawing" xmlns:w14="http://schemas.microsoft.com/office/word/2010/wordml" xmlns:w15="http://schemas.microsoft.com/office/word/2012/wordml" mc:Ignorable="w14 wp14 w15">
   <w:tbl>
     <w:tblPr>
       <w:tblW w:w="9345" w:type="dxa"/>
@@ -2942,7 +3911,7 @@
 </file>
 
 <file path=word/header3.xml><?xml version="1.0" encoding="utf-8"?>
-<w:hdr xmlns:o="urn:schemas-microsoft-com:office:office" xmlns:r="http://schemas.openxmlformats.org/officeDocument/2006/relationships" xmlns:v="urn:schemas-microsoft-com:vml" xmlns:w="http://schemas.openxmlformats.org/wordprocessingml/2006/main" xmlns:w10="urn:schemas-microsoft-com:office:word" xmlns:wp="http://schemas.openxmlformats.org/drawingml/2006/wordprocessingDrawing" xmlns:pic="http://schemas.openxmlformats.org/drawingml/2006/picture" xmlns:wps="http://schemas.microsoft.com/office/word/2010/wordprocessingShape" xmlns:wpg="http://schemas.microsoft.com/office/word/2010/wordprocessingGroup" xmlns:mc="http://schemas.openxmlformats.org/markup-compatibility/2006" xmlns:wp14="http://schemas.microsoft.com/office/word/2010/wordprocessingDrawing" xmlns:w14="http://schemas.microsoft.com/office/word/2010/wordml" xmlns:w15="http://schemas.microsoft.com/office/word/2012/wordml" mc:Ignorable="w14 wp14 w15">
+<w:hdr xmlns:o="urn:schemas-microsoft-com:office:office" xmlns:r="http://schemas.openxmlformats.org/officeDocument/2006/relationships" xmlns:v="urn:schemas-microsoft-com:vml" xmlns:w="http://schemas.openxmlformats.org/wordprocessingml/2006/main" xmlns:w10="urn:schemas-microsoft-com:office:word" xmlns:wp="http://schemas.openxmlformats.org/drawingml/2006/wordprocessingDrawing" xmlns:wps="http://schemas.microsoft.com/office/word/2010/wordprocessingShape" xmlns:wpg="http://schemas.microsoft.com/office/word/2010/wordprocessingGroup" xmlns:mc="http://schemas.openxmlformats.org/markup-compatibility/2006" xmlns:wp14="http://schemas.microsoft.com/office/word/2010/wordprocessingDrawing" xmlns:w14="http://schemas.microsoft.com/office/word/2010/wordml" xmlns:w15="http://schemas.microsoft.com/office/word/2012/wordml" mc:Ignorable="w14 wp14 w15">
   <w:tbl>
     <w:tblPr>
       <w:tblW w:w="9345" w:type="dxa"/>
@@ -3400,6 +4369,125 @@
   <w:abstractNum w:abstractNumId="4">
     <w:lvl w:ilvl="0">
       <w:start w:val="1"/>
+      <w:numFmt w:val="decimal"/>
+      <w:lvlText w:val="%1."/>
+      <w:lvlJc w:val="left"/>
+      <w:pPr>
+        <w:tabs>
+          <w:tab w:val="num" w:pos="720"/>
+        </w:tabs>
+        <w:ind w:left="720" w:hanging="360"/>
+      </w:pPr>
+      <w:rPr/>
+    </w:lvl>
+    <w:lvl w:ilvl="1">
+      <w:start w:val="1"/>
+      <w:numFmt w:val="decimal"/>
+      <w:lvlText w:val="%2."/>
+      <w:lvlJc w:val="left"/>
+      <w:pPr>
+        <w:tabs>
+          <w:tab w:val="num" w:pos="1080"/>
+        </w:tabs>
+        <w:ind w:left="1080" w:hanging="360"/>
+      </w:pPr>
+      <w:rPr/>
+    </w:lvl>
+    <w:lvl w:ilvl="2">
+      <w:start w:val="1"/>
+      <w:numFmt w:val="decimal"/>
+      <w:lvlText w:val="%3."/>
+      <w:lvlJc w:val="left"/>
+      <w:pPr>
+        <w:tabs>
+          <w:tab w:val="num" w:pos="1440"/>
+        </w:tabs>
+        <w:ind w:left="1440" w:hanging="360"/>
+      </w:pPr>
+      <w:rPr/>
+    </w:lvl>
+    <w:lvl w:ilvl="3">
+      <w:start w:val="1"/>
+      <w:numFmt w:val="decimal"/>
+      <w:lvlText w:val="%4."/>
+      <w:lvlJc w:val="left"/>
+      <w:pPr>
+        <w:tabs>
+          <w:tab w:val="num" w:pos="1800"/>
+        </w:tabs>
+        <w:ind w:left="1800" w:hanging="360"/>
+      </w:pPr>
+      <w:rPr/>
+    </w:lvl>
+    <w:lvl w:ilvl="4">
+      <w:start w:val="1"/>
+      <w:numFmt w:val="decimal"/>
+      <w:lvlText w:val="%5."/>
+      <w:lvlJc w:val="left"/>
+      <w:pPr>
+        <w:tabs>
+          <w:tab w:val="num" w:pos="2160"/>
+        </w:tabs>
+        <w:ind w:left="2160" w:hanging="360"/>
+      </w:pPr>
+      <w:rPr/>
+    </w:lvl>
+    <w:lvl w:ilvl="5">
+      <w:start w:val="1"/>
+      <w:numFmt w:val="decimal"/>
+      <w:lvlText w:val="%6."/>
+      <w:lvlJc w:val="left"/>
+      <w:pPr>
+        <w:tabs>
+          <w:tab w:val="num" w:pos="2520"/>
+        </w:tabs>
+        <w:ind w:left="2520" w:hanging="360"/>
+      </w:pPr>
+      <w:rPr/>
+    </w:lvl>
+    <w:lvl w:ilvl="6">
+      <w:start w:val="1"/>
+      <w:numFmt w:val="decimal"/>
+      <w:lvlText w:val="%7."/>
+      <w:lvlJc w:val="left"/>
+      <w:pPr>
+        <w:tabs>
+          <w:tab w:val="num" w:pos="2880"/>
+        </w:tabs>
+        <w:ind w:left="2880" w:hanging="360"/>
+      </w:pPr>
+      <w:rPr/>
+    </w:lvl>
+    <w:lvl w:ilvl="7">
+      <w:start w:val="1"/>
+      <w:numFmt w:val="decimal"/>
+      <w:lvlText w:val="%8."/>
+      <w:lvlJc w:val="left"/>
+      <w:pPr>
+        <w:tabs>
+          <w:tab w:val="num" w:pos="3240"/>
+        </w:tabs>
+        <w:ind w:left="3240" w:hanging="360"/>
+      </w:pPr>
+      <w:rPr/>
+    </w:lvl>
+    <w:lvl w:ilvl="8">
+      <w:start w:val="1"/>
+      <w:numFmt w:val="decimal"/>
+      <w:lvlText w:val="%9."/>
+      <w:lvlJc w:val="left"/>
+      <w:pPr>
+        <w:tabs>
+          <w:tab w:val="num" w:pos="3600"/>
+        </w:tabs>
+        <w:ind w:left="3600" w:hanging="360"/>
+      </w:pPr>
+      <w:rPr/>
+    </w:lvl>
+  </w:abstractNum>
+  <w:abstractNum w:abstractNumId="5">
+    <w:lvl w:ilvl="0">
+      <w:start w:val="1"/>
       <w:numFmt w:val="none"/>
       <w:suff w:val="nothing"/>
       <w:lvlText w:val=""/>
@@ -3527,6 +4615,9 @@
   </w:num>
   <w:num w:numId="4">
     <w:abstractNumId w:val="4"/>
+  </w:num>
+  <w:num w:numId="5">
+    <w:abstractNumId w:val="5"/>
   </w:num>
 </w:numbering>
 </file>
@@ -3946,7 +5037,7 @@
     </w:rPr>
   </w:style>
   <w:style w:type="paragraph" w:styleId="Heading1">
-    <w:name w:val="heading 1"/>
+    <w:name w:val="Heading 1"/>
     <w:basedOn w:val="Normal"/>
     <w:next w:val="Normal"/>
     <w:link w:val="1"/>
@@ -3967,7 +5058,7 @@
     </w:rPr>
   </w:style>
   <w:style w:type="paragraph" w:styleId="Heading2">
-    <w:name w:val="heading 2"/>
+    <w:name w:val="Heading 2"/>
     <w:basedOn w:val="Normal"/>
     <w:next w:val="BodyText"/>
     <w:qFormat/>
@@ -3983,7 +5074,7 @@
     </w:rPr>
   </w:style>
   <w:style w:type="paragraph" w:styleId="Heading3">
-    <w:name w:val="heading 3"/>
+    <w:name w:val="Heading 3"/>
     <w:basedOn w:val="Normal"/>
     <w:next w:val="BodyText"/>
     <w:qFormat/>
@@ -4045,28 +5136,22 @@
     <w:qFormat/>
     <w:rPr/>
   </w:style>
-  <w:style w:type="character" w:styleId="user" w:customStyle="1">
-    <w:name w:val="Ссылка указателя (user)"/>
+  <w:style w:type="character" w:styleId="Style13" w:customStyle="1">
+    <w:name w:val="Ссылка указателя"/>
     <w:qFormat/>
     <w:rPr/>
   </w:style>
-  <w:style w:type="character" w:styleId="user1" w:customStyle="1">
-    <w:name w:val="Маркеры (user)"/>
+  <w:style w:type="character" w:styleId="Style14" w:customStyle="1">
+    <w:name w:val="Маркеры"/>
     <w:qFormat/>
     <w:rPr>
       <w:rFonts w:ascii="OpenSymbol" w:hAnsi="OpenSymbol" w:eastAsia="OpenSymbol" w:cs="OpenSymbol"/>
     </w:rPr>
   </w:style>
-  <w:style w:type="character" w:styleId="user2" w:customStyle="1">
-    <w:name w:val="Символ нумерации (user)"/>
+  <w:style w:type="character" w:styleId="Style15">
+    <w:name w:val="Символ нумерации"/>
     <w:qFormat/>
-    <w:rPr>
-      <w:rFonts w:ascii="Times New Roman" w:hAnsi="Times New Roman"/>
-      <w:position w:val="0"/>
-      <w:sz w:val="28"/>
-      <w:szCs w:val="28"/>
-      <w:vertAlign w:val="baseline"/>
-    </w:rPr>
+    <w:rPr/>
   </w:style>
   <w:style w:type="character" w:styleId="Strong">
     <w:name w:val="Strong"/>
@@ -4083,19 +5168,14 @@
       <w:u w:val="single"/>
     </w:rPr>
   </w:style>
-  <w:style w:type="character" w:styleId="user3" w:customStyle="1">
-    <w:name w:val="Исходный текст (user)"/>
+  <w:style w:type="character" w:styleId="Style16" w:customStyle="1">
+    <w:name w:val="Исходный текст"/>
     <w:qFormat/>
     <w:rPr>
       <w:rFonts w:ascii="Liberation Mono" w:hAnsi="Liberation Mono" w:eastAsia="Liberation Mono" w:cs="Liberation Mono"/>
     </w:rPr>
   </w:style>
-  <w:style w:type="character" w:styleId="Style13">
-    <w:name w:val="Символ нумерации"/>
-    <w:qFormat/>
-    <w:rPr/>
-  </w:style>
-  <w:style w:type="paragraph" w:styleId="Style14">
+  <w:style w:type="paragraph" w:styleId="Style17">
     <w:name w:val="Заголовок"/>
     <w:basedOn w:val="Normal"/>
     <w:next w:val="BodyText"/>
@@ -4105,7 +5185,7 @@
       <w:spacing w:before="240" w:after="120"/>
     </w:pPr>
     <w:rPr>
-      <w:rFonts w:ascii="Liberation Sans" w:hAnsi="Liberation Sans" w:eastAsia="Microsoft YaHei" w:cs="Arial"/>
+      <w:rFonts w:ascii="Liberation Sans" w:hAnsi="Liberation Sans" w:eastAsia="Microsoft YaHei" w:cs="Lucida Sans"/>
       <w:sz w:val="28"/>
       <w:szCs w:val="28"/>
     </w:rPr>
@@ -4129,7 +5209,7 @@
     </w:rPr>
   </w:style>
   <w:style w:type="paragraph" w:styleId="Caption">
-    <w:name w:val="caption"/>
+    <w:name w:val="Caption"/>
     <w:basedOn w:val="Normal"/>
     <w:qFormat/>
     <w:pPr>
@@ -4144,7 +5224,7 @@
       <w:szCs w:val="24"/>
     </w:rPr>
   </w:style>
-  <w:style w:type="paragraph" w:styleId="Style15">
+  <w:style w:type="paragraph" w:styleId="Style18">
     <w:name w:val="Указатель"/>
     <w:basedOn w:val="Normal"/>
     <w:qFormat/>
@@ -4152,33 +5232,23 @@
       <w:suppressLineNumbers/>
     </w:pPr>
     <w:rPr>
-      <w:rFonts w:cs="Arial"/>
+      <w:rFonts w:cs="Lucida Sans"/>
     </w:rPr>
   </w:style>
-  <w:style w:type="paragraph" w:styleId="user4">
-    <w:name w:val="Заголовок (user)"/>
-    <w:basedOn w:val="Normal"/>
-    <w:next w:val="BodyText"/>
-    <w:qFormat/>
-    <w:pPr>
-      <w:keepNext w:val="true"/>
-      <w:spacing w:before="240" w:after="120"/>
-    </w:pPr>
-    <w:rPr>
-      <w:rFonts w:ascii="Liberation Sans" w:hAnsi="Liberation Sans" w:eastAsia="Microsoft YaHei" w:cs="Lucida Sans"/>
-      <w:sz w:val="28"/>
-      <w:szCs w:val="28"/>
-    </w:rPr>
-  </w:style>
-  <w:style w:type="paragraph" w:styleId="user5">
-    <w:name w:val="Указатель (user)"/>
+  <w:style w:type="paragraph" w:styleId="Caption1">
+    <w:name w:val="caption1"/>
     <w:basedOn w:val="Normal"/>
     <w:qFormat/>
     <w:pPr>
       <w:suppressLineNumbers/>
+      <w:spacing w:before="120" w:after="120"/>
     </w:pPr>
     <w:rPr>
       <w:rFonts w:cs="Lucida Sans"/>
+      <w:i/>
+      <w:iCs/>
+      <w:sz w:val="24"/>
+      <w:szCs w:val="24"/>
     </w:rPr>
   </w:style>
   <w:style w:type="paragraph" w:styleId="Title">
@@ -4196,30 +5266,7 @@
       <w:szCs w:val="56"/>
     </w:rPr>
   </w:style>
-  <w:style w:type="paragraph" w:styleId="caption1">
-    <w:name w:val="caption1"/>
-    <w:basedOn w:val="Normal"/>
-    <w:qFormat/>
-    <w:pPr>
-      <w:suppressLineNumbers/>
-      <w:spacing w:before="120" w:after="120"/>
-    </w:pPr>
-    <w:rPr>
-      <w:rFonts w:cs="Lucida Sans"/>
-      <w:i/>
-      <w:iCs/>
-      <w:sz w:val="24"/>
-      <w:szCs w:val="24"/>
-    </w:rPr>
-  </w:style>
-  <w:style w:type="paragraph" w:styleId="indexheading1">
-    <w:name w:val="index heading1"/>
-    <w:basedOn w:val="Title"/>
-    <w:qFormat/>
-    <w:pPr/>
-    <w:rPr/>
-  </w:style>
-  <w:style w:type="paragraph" w:styleId="caption11" w:customStyle="1">
+  <w:style w:type="paragraph" w:styleId="Caption11">
     <w:name w:val="caption11"/>
     <w:basedOn w:val="Normal"/>
     <w:qFormat/>
@@ -4235,7 +5282,14 @@
       <w:szCs w:val="24"/>
     </w:rPr>
   </w:style>
-  <w:style w:type="paragraph" w:styleId="caption111" w:customStyle="1">
+  <w:style w:type="paragraph" w:styleId="Indexheading1">
+    <w:name w:val="index heading1"/>
+    <w:basedOn w:val="Title"/>
+    <w:qFormat/>
+    <w:pPr/>
+    <w:rPr/>
+  </w:style>
+  <w:style w:type="paragraph" w:styleId="Caption111" w:customStyle="1">
     <w:name w:val="caption111"/>
     <w:basedOn w:val="Normal"/>
     <w:qFormat/>
@@ -4251,15 +5305,31 @@
       <w:szCs w:val="24"/>
     </w:rPr>
   </w:style>
-  <w:style w:type="paragraph" w:styleId="indexheading11" w:customStyle="1">
+  <w:style w:type="paragraph" w:styleId="Caption1111" w:customStyle="1">
+    <w:name w:val="caption1111"/>
+    <w:basedOn w:val="Normal"/>
+    <w:qFormat/>
+    <w:pPr>
+      <w:suppressLineNumbers/>
+      <w:spacing w:before="120" w:after="120"/>
+    </w:pPr>
+    <w:rPr>
+      <w:rFonts w:cs="Lucida Sans"/>
+      <w:i/>
+      <w:iCs/>
+      <w:sz w:val="24"/>
+      <w:szCs w:val="24"/>
+    </w:rPr>
+  </w:style>
+  <w:style w:type="paragraph" w:styleId="Indexheading11" w:customStyle="1">
     <w:name w:val="index heading11"/>
     <w:basedOn w:val="Title"/>
     <w:qFormat/>
     <w:pPr/>
     <w:rPr/>
   </w:style>
-  <w:style w:type="paragraph" w:styleId="caption1111" w:customStyle="1">
-    <w:name w:val="caption1111"/>
+  <w:style w:type="paragraph" w:styleId="Caption11111" w:customStyle="1">
+    <w:name w:val="caption11111"/>
     <w:basedOn w:val="Normal"/>
     <w:qFormat/>
     <w:pPr>
@@ -4274,7 +5344,7 @@
       <w:szCs w:val="24"/>
     </w:rPr>
   </w:style>
-  <w:style w:type="paragraph" w:styleId="indexheading111" w:customStyle="1">
+  <w:style w:type="paragraph" w:styleId="Indexheading111" w:customStyle="1">
     <w:name w:val="index heading111"/>
     <w:basedOn w:val="Normal"/>
     <w:qFormat/>
@@ -4282,7 +5352,7 @@
     <w:rPr/>
   </w:style>
   <w:style w:type="paragraph" w:styleId="TOC1">
-    <w:name w:val="toc 1"/>
+    <w:name w:val="TOC 1"/>
     <w:basedOn w:val="Normal"/>
     <w:next w:val="Normal"/>
     <w:autoRedefine/>
@@ -4293,21 +5363,14 @@
     </w:pPr>
     <w:rPr/>
   </w:style>
-  <w:style w:type="paragraph" w:styleId="Style16" w:customStyle="1">
+  <w:style w:type="paragraph" w:styleId="Style19" w:customStyle="1">
     <w:name w:val="Колонтитул"/>
     <w:basedOn w:val="Normal"/>
     <w:qFormat/>
     <w:pPr/>
     <w:rPr/>
   </w:style>
-  <w:style w:type="paragraph" w:styleId="user6" w:customStyle="1">
-    <w:name w:val="Колонтитулы (user)"/>
-    <w:basedOn w:val="Normal"/>
-    <w:qFormat/>
-    <w:pPr/>
-    <w:rPr/>
-  </w:style>
-  <w:style w:type="paragraph" w:styleId="Style17">
+  <w:style w:type="paragraph" w:styleId="Style20">
     <w:name w:val="Колонтитулы"/>
     <w:basedOn w:val="Normal"/>
     <w:qFormat/>
@@ -4315,7 +5378,7 @@
     <w:rPr/>
   </w:style>
   <w:style w:type="paragraph" w:styleId="Header">
-    <w:name w:val="header"/>
+    <w:name w:val="Header"/>
     <w:basedOn w:val="Normal"/>
     <w:link w:val="Style11"/>
     <w:uiPriority w:val="99"/>
@@ -4331,7 +5394,7 @@
     <w:rPr/>
   </w:style>
   <w:style w:type="paragraph" w:styleId="Footer">
-    <w:name w:val="footer"/>
+    <w:name w:val="Footer"/>
     <w:basedOn w:val="Normal"/>
     <w:link w:val="Style12"/>
     <w:uiPriority w:val="99"/>
@@ -4358,16 +5421,23 @@
     </w:pPr>
     <w:rPr/>
   </w:style>
-  <w:style w:type="paragraph" w:styleId="indexheading2" w:customStyle="1">
+  <w:style w:type="paragraph" w:styleId="Indexheading2" w:customStyle="1">
     <w:name w:val="index heading2"/>
     <w:basedOn w:val="Title"/>
     <w:qFormat/>
     <w:pPr/>
     <w:rPr/>
   </w:style>
+  <w:style w:type="paragraph" w:styleId="Indexheading3">
+    <w:name w:val="index heading3"/>
+    <w:basedOn w:val="Style17"/>
+    <w:qFormat/>
+    <w:pPr/>
+    <w:rPr/>
+  </w:style>
   <w:style w:type="paragraph" w:styleId="IndexHeading">
-    <w:name w:val="index heading"/>
-    <w:basedOn w:val="user4"/>
+    <w:name w:val="Index Heading"/>
+    <w:basedOn w:val="Style17"/>
     <w:pPr/>
     <w:rPr/>
   </w:style>
@@ -4387,27 +5457,22 @@
       <w:lang w:val="en-US"/>
     </w:rPr>
   </w:style>
-  <w:style w:type="paragraph" w:styleId="user7" w:customStyle="1">
-    <w:name w:val="Рисунок (user)"/>
-    <w:basedOn w:val="caption1111"/>
+  <w:style w:type="paragraph" w:styleId="Style21">
+    <w:name w:val="Рисунок"/>
+    <w:basedOn w:val="Caption1"/>
     <w:qFormat/>
     <w:pPr/>
-    <w:rPr>
-      <w:i w:val="false"/>
-      <w:iCs w:val="false"/>
-      <w:sz w:val="28"/>
-      <w:szCs w:val="28"/>
-    </w:rPr>
+    <w:rPr/>
   </w:style>
-  <w:style w:type="paragraph" w:styleId="user8" w:customStyle="1">
-    <w:name w:val="Содержимое врезки (user)"/>
+  <w:style w:type="paragraph" w:styleId="Style22">
+    <w:name w:val="Содержимое врезки"/>
     <w:basedOn w:val="Normal"/>
     <w:qFormat/>
     <w:pPr/>
     <w:rPr/>
   </w:style>
-  <w:style w:type="paragraph" w:styleId="user9" w:customStyle="1">
-    <w:name w:val="Содержимое таблицы (user)"/>
+  <w:style w:type="paragraph" w:styleId="Style23" w:customStyle="1">
+    <w:name w:val="Содержимое таблицы"/>
     <w:basedOn w:val="Normal"/>
     <w:qFormat/>
     <w:pPr>
@@ -4416,9 +5481,9 @@
     </w:pPr>
     <w:rPr/>
   </w:style>
-  <w:style w:type="paragraph" w:styleId="user10" w:customStyle="1">
-    <w:name w:val="Заголовок таблицы (user)"/>
-    <w:basedOn w:val="user9"/>
+  <w:style w:type="paragraph" w:styleId="Style24" w:customStyle="1">
+    <w:name w:val="Заголовок таблицы"/>
+    <w:basedOn w:val="Style23"/>
     <w:qFormat/>
     <w:pPr>
       <w:jc w:val="center"/>
@@ -4428,22 +5493,22 @@
       <w:bCs/>
     </w:rPr>
   </w:style>
-  <w:style w:type="paragraph" w:styleId="user11" w:customStyle="1">
-    <w:name w:val="Фигура (user)"/>
-    <w:basedOn w:val="caption1111"/>
+  <w:style w:type="paragraph" w:styleId="Style25" w:customStyle="1">
+    <w:name w:val="Фигура"/>
+    <w:basedOn w:val="Caption11111"/>
     <w:qFormat/>
     <w:pPr/>
     <w:rPr/>
   </w:style>
-  <w:style w:type="paragraph" w:styleId="Style18" w:customStyle="1">
+  <w:style w:type="paragraph" w:styleId="Style26" w:customStyle="1">
     <w:name w:val="График"/>
-    <w:basedOn w:val="caption1111"/>
+    <w:basedOn w:val="Caption11111"/>
     <w:qFormat/>
     <w:pPr/>
     <w:rPr/>
   </w:style>
   <w:style w:type="paragraph" w:styleId="TOC2">
-    <w:name w:val="toc 2"/>
+    <w:name w:val="TOC 2"/>
     <w:basedOn w:val="Normal"/>
     <w:uiPriority w:val="39"/>
     <w:pPr>
@@ -4456,7 +5521,7 @@
     <w:rPr/>
   </w:style>
   <w:style w:type="paragraph" w:styleId="TOC3">
-    <w:name w:val="toc 3"/>
+    <w:name w:val="TOC 3"/>
     <w:basedOn w:val="Normal"/>
     <w:pPr>
       <w:tabs>
@@ -4467,29 +5532,8 @@
     </w:pPr>
     <w:rPr/>
   </w:style>
-  <w:style w:type="paragraph" w:styleId="Style19">
-    <w:name w:val="Содержимое врезки"/>
-    <w:basedOn w:val="Normal"/>
-    <w:qFormat/>
-    <w:pPr/>
-    <w:rPr/>
-  </w:style>
-  <w:style w:type="paragraph" w:styleId="Style20">
-    <w:name w:val="Рисунок"/>
-    <w:basedOn w:val="Caption"/>
-    <w:qFormat/>
-    <w:pPr/>
-    <w:rPr/>
-  </w:style>
-  <w:style w:type="numbering" w:styleId="Style21" w:default="1">
+  <w:style w:type="numbering" w:styleId="Style27" w:customStyle="1">
     <w:name w:val="Без списка"/>
-    <w:uiPriority w:val="99"/>
-    <w:semiHidden/>
-    <w:unhideWhenUsed/>
-    <w:qFormat/>
-  </w:style>
-  <w:style w:type="numbering" w:styleId="user12" w:customStyle="1">
-    <w:name w:val="Без списка (user)"/>
     <w:uiPriority w:val="99"/>
     <w:semiHidden/>
     <w:unhideWhenUsed/>

</xml_diff>